<commit_message>
Esignature + Dynamic template done
</commit_message>
<xml_diff>
--- a/HCMS-Api/wwwroot/uploads/templates/A- Format SOP Template.docx
+++ b/HCMS-Api/wwwroot/uploads/templates/A- Format SOP Template.docx
@@ -2,2380 +2,19 @@
 <file path=word/document.xml><?xml version="1.0" encoding="utf-8"?>
 <w:document xmlns:wpc="http://schemas.microsoft.com/office/word/2010/wordprocessingCanvas" xmlns:cx="http://schemas.microsoft.com/office/drawing/2014/chartex" xmlns:cx1="http://schemas.microsoft.com/office/drawing/2015/9/8/chartex" xmlns:cx2="http://schemas.microsoft.com/office/drawing/2015/10/21/chartex" xmlns:cx3="http://schemas.microsoft.com/office/drawing/2016/5/9/chartex" xmlns:cx4="http://schemas.microsoft.com/office/drawing/2016/5/10/chartex" xmlns:cx5="http://schemas.microsoft.com/office/drawing/2016/5/11/chartex" xmlns:cx6="http://schemas.microsoft.com/office/drawing/2016/5/12/chartex" xmlns:cx7="http://schemas.microsoft.com/office/drawing/2016/5/13/chartex" xmlns:cx8="http://schemas.microsoft.com/office/drawing/2016/5/14/chartex" xmlns:mc="http://schemas.openxmlformats.org/markup-compatibility/2006" xmlns:aink="http://schemas.microsoft.com/office/drawing/2016/ink" xmlns:am3d="http://schemas.microsoft.com/office/drawing/2017/model3d" xmlns:o="urn:schemas-microsoft-com:office:office" xmlns:oel="http://schemas.microsoft.com/office/2019/extlst" xmlns:r="http://schemas.openxmlformats.org/officeDocument/2006/relationships" xmlns:m="http://schemas.openxmlformats.org/officeDocument/2006/math" xmlns:v="urn:schemas-microsoft-com:vml" xmlns:wp14="http://schemas.microsoft.com/office/word/2010/wordprocessingDrawing" xmlns:wp="http://schemas.openxmlformats.org/drawingml/2006/wordprocessingDrawing" xmlns:w10="urn:schemas-microsoft-com:office:word" xmlns:w="http://schemas.openxmlformats.org/wordprocessingml/2006/main" xmlns:w14="http://schemas.microsoft.com/office/word/2010/wordml" xmlns:w15="http://schemas.microsoft.com/office/word/2012/wordml" xmlns:w16cex="http://schemas.microsoft.com/office/word/2018/wordml/cex" xmlns:w16cid="http://schemas.microsoft.com/office/word/2016/wordml/cid" xmlns:w16="http://schemas.microsoft.com/office/word/2018/wordml" xmlns:w16du="http://schemas.microsoft.com/office/word/2023/wordml/word16du" xmlns:w16sdtdh="http://schemas.microsoft.com/office/word/2020/wordml/sdtdatahash" xmlns:w16sdtfl="http://schemas.microsoft.com/office/word/2024/wordml/sdtformatlock" xmlns:w16se="http://schemas.microsoft.com/office/word/2015/wordml/symex" xmlns:wpg="http://schemas.microsoft.com/office/word/2010/wordprocessingGroup" xmlns:wpi="http://schemas.microsoft.com/office/word/2010/wordprocessingInk" xmlns:wne="http://schemas.microsoft.com/office/word/2006/wordml" xmlns:wps="http://schemas.microsoft.com/office/word/2010/wordprocessingShape" mc:Ignorable="w14 w15 w16se w16cid w16 w16cex w16sdtdh w16sdtfl w16du wp14">
   <w:body>
-    <w:tbl>
-      <w:tblPr>
-        <w:tblStyle w:val="TableGrid"/>
-        <w:tblW w:w="10544" w:type="dxa"/>
-        <w:tblInd w:w="-612" w:type="dxa"/>
-        <w:tblBorders>
-          <w:top w:val="single" w:sz="4" w:space="0" w:color="auto"/>
-          <w:left w:val="single" w:sz="4" w:space="0" w:color="auto"/>
-          <w:bottom w:val="single" w:sz="4" w:space="0" w:color="auto"/>
-          <w:right w:val="single" w:sz="4" w:space="0" w:color="auto"/>
-          <w:insideH w:val="single" w:sz="4" w:space="0" w:color="auto"/>
-          <w:insideV w:val="single" w:sz="4" w:space="0" w:color="auto"/>
-        </w:tblBorders>
-        <w:tblLook w:val="04A0" w:firstRow="1" w:lastRow="0" w:firstColumn="1" w:lastColumn="0" w:noHBand="0" w:noVBand="1"/>
-      </w:tblPr>
-      <w:tblGrid>
-        <w:gridCol w:w="900"/>
-        <w:gridCol w:w="9644"/>
-      </w:tblGrid>
-      <w:tr>
-        <w:trPr>
-          <w:trHeight w:val="288"/>
-        </w:trPr>
-        <w:tc>
-          <w:tcPr>
-            <w:tcW w:w="900" w:type="dxa"/>
-          </w:tcPr>
-          <w:p>
-            <w:pPr>
-              <w:pStyle w:val="ListParagraph"/>
-              <w:numPr>
-                <w:ilvl w:val="0"/>
-                <w:numId w:val="18"/>
-              </w:numPr>
-              <w:spacing w:before="0" w:line="240" w:lineRule="auto"/>
-              <w:ind w:right="-360"/>
-              <w:rPr>
-                <w:rFonts w:ascii="Times New Roman" w:hAnsi="Times New Roman"/>
-                <w:szCs w:val="22"/>
-              </w:rPr>
-            </w:pPr>
-          </w:p>
-        </w:tc>
-        <w:tc>
-          <w:tcPr>
-            <w:tcW w:w="9644" w:type="dxa"/>
-          </w:tcPr>
-          <w:p>
-            <w:pPr>
-              <w:spacing w:before="0" w:line="240" w:lineRule="auto"/>
-              <w:ind w:right="-360"/>
-              <w:rPr>
-                <w:rFonts w:ascii="Times New Roman" w:hAnsi="Times New Roman"/>
-                <w:szCs w:val="22"/>
-              </w:rPr>
-            </w:pPr>
-            <w:r>
-              <w:rPr>
-                <w:rFonts w:ascii="Times New Roman" w:hAnsi="Times New Roman"/>
-                <w:b/>
-                <w:szCs w:val="22"/>
-              </w:rPr>
-              <w:t>Purpose:</w:t>
-            </w:r>
-          </w:p>
-        </w:tc>
-      </w:tr>
-      <w:tr>
-        <w:trPr>
-          <w:trHeight w:val="288"/>
-        </w:trPr>
-        <w:tc>
-          <w:tcPr>
-            <w:tcW w:w="900" w:type="dxa"/>
-          </w:tcPr>
-          <w:p>
-            <w:pPr>
-              <w:spacing w:before="0" w:line="240" w:lineRule="auto"/>
-              <w:ind w:right="-360"/>
-              <w:rPr>
-                <w:rFonts w:ascii="Times New Roman" w:hAnsi="Times New Roman"/>
-                <w:b/>
-                <w:szCs w:val="22"/>
-              </w:rPr>
-            </w:pPr>
-          </w:p>
-        </w:tc>
-        <w:tc>
-          <w:tcPr>
-            <w:tcW w:w="9644" w:type="dxa"/>
-          </w:tcPr>
-          <w:p>
-            <w:pPr>
-              <w:spacing w:before="0" w:line="240" w:lineRule="auto"/>
-              <w:contextualSpacing/>
-              <w:jc w:val="both"/>
-              <w:rPr>
-                <w:rFonts w:ascii="Times New Roman" w:hAnsi="Times New Roman"/>
-                <w:color w:val="000000" w:themeColor="text1"/>
-                <w:szCs w:val="22"/>
-              </w:rPr>
-            </w:pPr>
-          </w:p>
-        </w:tc>
-      </w:tr>
-    </w:tbl>
     <w:p>
       <w:pPr>
-        <w:spacing w:before="0"/>
-      </w:pPr>
-    </w:p>
-    <w:tbl>
-      <w:tblPr>
-        <w:tblStyle w:val="TableGrid"/>
-        <w:tblW w:w="10544" w:type="dxa"/>
-        <w:tblInd w:w="-612" w:type="dxa"/>
-        <w:tblBorders>
-          <w:top w:val="single" w:sz="4" w:space="0" w:color="auto"/>
-          <w:left w:val="single" w:sz="4" w:space="0" w:color="auto"/>
-          <w:bottom w:val="single" w:sz="4" w:space="0" w:color="auto"/>
-          <w:right w:val="single" w:sz="4" w:space="0" w:color="auto"/>
-          <w:insideH w:val="single" w:sz="4" w:space="0" w:color="auto"/>
-          <w:insideV w:val="single" w:sz="4" w:space="0" w:color="auto"/>
-        </w:tblBorders>
-        <w:tblLook w:val="04A0" w:firstRow="1" w:lastRow="0" w:firstColumn="1" w:lastColumn="0" w:noHBand="0" w:noVBand="1"/>
-      </w:tblPr>
-      <w:tblGrid>
-        <w:gridCol w:w="900"/>
-        <w:gridCol w:w="9644"/>
-      </w:tblGrid>
-      <w:tr>
-        <w:trPr>
-          <w:trHeight w:val="288"/>
-        </w:trPr>
-        <w:tc>
-          <w:tcPr>
-            <w:tcW w:w="900" w:type="dxa"/>
-          </w:tcPr>
-          <w:p>
-            <w:pPr>
-              <w:pStyle w:val="ListParagraph"/>
-              <w:numPr>
-                <w:ilvl w:val="0"/>
-                <w:numId w:val="18"/>
-              </w:numPr>
-              <w:spacing w:before="0" w:line="240" w:lineRule="auto"/>
-              <w:ind w:right="-360"/>
-              <w:rPr>
-                <w:rFonts w:ascii="Times New Roman" w:hAnsi="Times New Roman"/>
-                <w:szCs w:val="22"/>
-              </w:rPr>
-            </w:pPr>
-          </w:p>
-        </w:tc>
-        <w:tc>
-          <w:tcPr>
-            <w:tcW w:w="9644" w:type="dxa"/>
-          </w:tcPr>
-          <w:p>
-            <w:pPr>
-              <w:spacing w:before="0" w:line="240" w:lineRule="auto"/>
-              <w:ind w:right="-360"/>
-              <w:rPr>
-                <w:rFonts w:ascii="Times New Roman" w:hAnsi="Times New Roman"/>
-                <w:b/>
-                <w:szCs w:val="22"/>
-              </w:rPr>
-            </w:pPr>
-            <w:r>
-              <w:rPr>
-                <w:rFonts w:ascii="Times New Roman" w:hAnsi="Times New Roman"/>
-                <w:b/>
-                <w:szCs w:val="22"/>
-              </w:rPr>
-              <w:t>Scope:</w:t>
-            </w:r>
-          </w:p>
-        </w:tc>
-      </w:tr>
-      <w:tr>
-        <w:trPr>
-          <w:trHeight w:val="288"/>
-        </w:trPr>
-        <w:tc>
-          <w:tcPr>
-            <w:tcW w:w="900" w:type="dxa"/>
-          </w:tcPr>
-          <w:p>
-            <w:pPr>
-              <w:spacing w:before="0" w:line="240" w:lineRule="auto"/>
-              <w:ind w:right="-360"/>
-              <w:rPr>
-                <w:rFonts w:ascii="Times New Roman" w:hAnsi="Times New Roman"/>
-                <w:b/>
-                <w:szCs w:val="22"/>
-              </w:rPr>
-            </w:pPr>
-          </w:p>
-        </w:tc>
-        <w:tc>
-          <w:tcPr>
-            <w:tcW w:w="9644" w:type="dxa"/>
-          </w:tcPr>
-          <w:p>
-            <w:pPr>
-              <w:spacing w:before="0" w:line="240" w:lineRule="auto"/>
-              <w:contextualSpacing/>
-              <w:jc w:val="both"/>
-              <w:rPr>
-                <w:rFonts w:ascii="Times New Roman" w:hAnsi="Times New Roman"/>
-                <w:color w:val="000000" w:themeColor="text1"/>
-                <w:szCs w:val="22"/>
-              </w:rPr>
-            </w:pPr>
-          </w:p>
-        </w:tc>
-      </w:tr>
-    </w:tbl>
-    <w:p>
-      <w:pPr>
-        <w:spacing w:before="0"/>
-      </w:pPr>
-    </w:p>
-    <w:tbl>
-      <w:tblPr>
-        <w:tblStyle w:val="TableGrid"/>
-        <w:tblW w:w="10530" w:type="dxa"/>
-        <w:tblInd w:w="-612" w:type="dxa"/>
-        <w:tblBorders>
-          <w:top w:val="single" w:sz="4" w:space="0" w:color="auto"/>
-          <w:left w:val="single" w:sz="4" w:space="0" w:color="auto"/>
-          <w:bottom w:val="single" w:sz="4" w:space="0" w:color="auto"/>
-          <w:right w:val="single" w:sz="4" w:space="0" w:color="auto"/>
-          <w:insideH w:val="single" w:sz="4" w:space="0" w:color="auto"/>
-          <w:insideV w:val="single" w:sz="4" w:space="0" w:color="auto"/>
-        </w:tblBorders>
-        <w:tblLook w:val="04A0" w:firstRow="1" w:lastRow="0" w:firstColumn="1" w:lastColumn="0" w:noHBand="0" w:noVBand="1"/>
-      </w:tblPr>
-      <w:tblGrid>
-        <w:gridCol w:w="900"/>
-        <w:gridCol w:w="6660"/>
-        <w:gridCol w:w="2970"/>
-      </w:tblGrid>
-      <w:tr>
-        <w:trPr>
-          <w:trHeight w:val="288"/>
-        </w:trPr>
-        <w:tc>
-          <w:tcPr>
-            <w:tcW w:w="900" w:type="dxa"/>
-          </w:tcPr>
-          <w:p>
-            <w:pPr>
-              <w:pStyle w:val="ListParagraph"/>
-              <w:numPr>
-                <w:ilvl w:val="0"/>
-                <w:numId w:val="18"/>
-              </w:numPr>
-              <w:spacing w:before="0" w:line="240" w:lineRule="auto"/>
-              <w:ind w:right="-360"/>
-              <w:rPr>
-                <w:rFonts w:ascii="Times New Roman" w:hAnsi="Times New Roman"/>
-                <w:szCs w:val="22"/>
-              </w:rPr>
-            </w:pPr>
-          </w:p>
-        </w:tc>
-        <w:tc>
-          <w:tcPr>
-            <w:tcW w:w="9630" w:type="dxa"/>
-            <w:gridSpan w:val="2"/>
-          </w:tcPr>
-          <w:p>
-            <w:pPr>
-              <w:spacing w:before="0" w:line="240" w:lineRule="auto"/>
-              <w:ind w:right="-360"/>
-              <w:rPr>
-                <w:rFonts w:ascii="Times New Roman" w:hAnsi="Times New Roman"/>
-                <w:szCs w:val="22"/>
-              </w:rPr>
-            </w:pPr>
-            <w:r>
-              <w:rPr>
-                <w:rFonts w:ascii="Times New Roman" w:hAnsi="Times New Roman"/>
-                <w:b/>
-                <w:szCs w:val="22"/>
-              </w:rPr>
-              <w:t>Responsibilities:</w:t>
-            </w:r>
-          </w:p>
-        </w:tc>
-      </w:tr>
-      <w:tr>
-        <w:trPr>
-          <w:trHeight w:val="288"/>
-        </w:trPr>
-        <w:tc>
-          <w:tcPr>
-            <w:tcW w:w="900" w:type="dxa"/>
-          </w:tcPr>
-          <w:p>
-            <w:pPr>
-              <w:spacing w:before="0" w:line="240" w:lineRule="auto"/>
-              <w:ind w:right="-360"/>
-              <w:rPr>
-                <w:rFonts w:ascii="Times New Roman" w:hAnsi="Times New Roman"/>
-                <w:szCs w:val="22"/>
-              </w:rPr>
-            </w:pPr>
-            <w:r>
-              <w:rPr>
-                <w:rFonts w:ascii="Times New Roman" w:hAnsi="Times New Roman"/>
-                <w:b/>
-                <w:bCs/>
-                <w:szCs w:val="22"/>
-              </w:rPr>
-              <w:t>S. No.</w:t>
-            </w:r>
-          </w:p>
-        </w:tc>
-        <w:tc>
-          <w:tcPr>
-            <w:tcW w:w="6660" w:type="dxa"/>
-          </w:tcPr>
-          <w:p>
-            <w:pPr>
-              <w:spacing w:before="0" w:line="240" w:lineRule="auto"/>
-              <w:ind w:left="-43" w:right="-166"/>
-              <w:jc w:val="center"/>
-              <w:rPr>
-                <w:rFonts w:ascii="Times New Roman" w:hAnsi="Times New Roman"/>
-                <w:b/>
-                <w:bCs/>
-                <w:szCs w:val="22"/>
-              </w:rPr>
-            </w:pPr>
-            <w:r>
-              <w:rPr>
-                <w:rFonts w:ascii="Times New Roman" w:hAnsi="Times New Roman"/>
-                <w:b/>
-                <w:bCs/>
-                <w:szCs w:val="22"/>
-              </w:rPr>
-              <w:t>Action</w:t>
-            </w:r>
-          </w:p>
-        </w:tc>
-        <w:tc>
-          <w:tcPr>
-            <w:tcW w:w="2970" w:type="dxa"/>
-          </w:tcPr>
-          <w:p>
-            <w:pPr>
-              <w:spacing w:before="0" w:line="240" w:lineRule="auto"/>
-              <w:ind w:left="-43" w:right="-166"/>
-              <w:jc w:val="center"/>
-              <w:rPr>
-                <w:rFonts w:ascii="Times New Roman" w:hAnsi="Times New Roman"/>
-                <w:b/>
-                <w:bCs/>
-                <w:szCs w:val="22"/>
-              </w:rPr>
-            </w:pPr>
-            <w:r>
-              <w:rPr>
-                <w:rFonts w:ascii="Times New Roman" w:hAnsi="Times New Roman"/>
-                <w:b/>
-                <w:bCs/>
-                <w:szCs w:val="22"/>
-              </w:rPr>
-              <w:t>Responsibility</w:t>
-            </w:r>
-          </w:p>
-        </w:tc>
-      </w:tr>
-      <w:tr>
-        <w:trPr>
-          <w:trHeight w:val="288"/>
-        </w:trPr>
-        <w:tc>
-          <w:tcPr>
-            <w:tcW w:w="900" w:type="dxa"/>
-          </w:tcPr>
-          <w:p>
-            <w:pPr>
-              <w:pStyle w:val="ListParagraph"/>
-              <w:numPr>
-                <w:ilvl w:val="1"/>
-                <w:numId w:val="18"/>
-              </w:numPr>
-              <w:spacing w:before="0" w:line="240" w:lineRule="auto"/>
-              <w:ind w:right="-360"/>
-              <w:rPr>
-                <w:rFonts w:ascii="Times New Roman" w:hAnsi="Times New Roman"/>
-                <w:b/>
-                <w:szCs w:val="22"/>
-              </w:rPr>
-            </w:pPr>
-          </w:p>
-        </w:tc>
-        <w:tc>
-          <w:tcPr>
-            <w:tcW w:w="6660" w:type="dxa"/>
-          </w:tcPr>
-          <w:p>
-            <w:pPr>
-              <w:tabs>
-                <w:tab w:val="left" w:pos="1800"/>
-              </w:tabs>
-              <w:spacing w:before="0" w:line="240" w:lineRule="auto"/>
-              <w:rPr>
-                <w:rFonts w:ascii="Times New Roman" w:hAnsi="Times New Roman"/>
-                <w:szCs w:val="22"/>
-              </w:rPr>
-            </w:pPr>
-          </w:p>
-        </w:tc>
-        <w:tc>
-          <w:tcPr>
-            <w:tcW w:w="2970" w:type="dxa"/>
-            <w:vAlign w:val="center"/>
-          </w:tcPr>
-          <w:p>
-            <w:pPr>
-              <w:spacing w:before="0" w:line="240" w:lineRule="auto"/>
-              <w:ind w:right="-360"/>
-              <w:rPr>
-                <w:rFonts w:ascii="Times New Roman" w:hAnsi="Times New Roman"/>
-                <w:szCs w:val="22"/>
-              </w:rPr>
-            </w:pPr>
-          </w:p>
-        </w:tc>
-      </w:tr>
-    </w:tbl>
-    <w:p>
-      <w:pPr>
-        <w:spacing w:before="0"/>
-      </w:pPr>
-    </w:p>
-    <w:tbl>
-      <w:tblPr>
-        <w:tblStyle w:val="TableGrid"/>
-        <w:tblW w:w="10544" w:type="dxa"/>
-        <w:tblInd w:w="-612" w:type="dxa"/>
-        <w:tblBorders>
-          <w:top w:val="single" w:sz="4" w:space="0" w:color="auto"/>
-          <w:left w:val="single" w:sz="4" w:space="0" w:color="auto"/>
-          <w:bottom w:val="single" w:sz="4" w:space="0" w:color="auto"/>
-          <w:right w:val="single" w:sz="4" w:space="0" w:color="auto"/>
-          <w:insideH w:val="single" w:sz="4" w:space="0" w:color="auto"/>
-          <w:insideV w:val="single" w:sz="4" w:space="0" w:color="auto"/>
-        </w:tblBorders>
-        <w:tblLook w:val="04A0" w:firstRow="1" w:lastRow="0" w:firstColumn="1" w:lastColumn="0" w:noHBand="0" w:noVBand="1"/>
-      </w:tblPr>
-      <w:tblGrid>
-        <w:gridCol w:w="990"/>
-        <w:gridCol w:w="9554"/>
-      </w:tblGrid>
-      <w:tr>
-        <w:trPr>
-          <w:trHeight w:val="288"/>
-        </w:trPr>
-        <w:tc>
-          <w:tcPr>
-            <w:tcW w:w="990" w:type="dxa"/>
-          </w:tcPr>
-          <w:p>
-            <w:pPr>
-              <w:pStyle w:val="ListParagraph"/>
-              <w:numPr>
-                <w:ilvl w:val="0"/>
-                <w:numId w:val="18"/>
-              </w:numPr>
-              <w:spacing w:before="0" w:line="240" w:lineRule="auto"/>
-              <w:ind w:right="-360"/>
-              <w:rPr>
-                <w:rFonts w:ascii="Times New Roman" w:hAnsi="Times New Roman"/>
-                <w:szCs w:val="22"/>
-              </w:rPr>
-            </w:pPr>
-          </w:p>
-        </w:tc>
-        <w:tc>
-          <w:tcPr>
-            <w:tcW w:w="9554" w:type="dxa"/>
-          </w:tcPr>
-          <w:p>
-            <w:pPr>
-              <w:spacing w:before="0" w:line="240" w:lineRule="auto"/>
-              <w:ind w:right="-360"/>
-              <w:rPr>
-                <w:rFonts w:ascii="Times New Roman" w:hAnsi="Times New Roman"/>
-                <w:szCs w:val="22"/>
-              </w:rPr>
-            </w:pPr>
-            <w:r>
-              <w:rPr>
-                <w:rFonts w:ascii="Times New Roman" w:hAnsi="Times New Roman"/>
-                <w:b/>
-                <w:szCs w:val="22"/>
-              </w:rPr>
-              <w:t>Requirements:</w:t>
-            </w:r>
-          </w:p>
-        </w:tc>
-      </w:tr>
-      <w:tr>
-        <w:trPr>
-          <w:trHeight w:val="288"/>
-        </w:trPr>
-        <w:tc>
-          <w:tcPr>
-            <w:tcW w:w="990" w:type="dxa"/>
-          </w:tcPr>
-          <w:p>
-            <w:pPr>
-              <w:pStyle w:val="ListParagraph"/>
-              <w:numPr>
-                <w:ilvl w:val="1"/>
-                <w:numId w:val="18"/>
-              </w:numPr>
-              <w:spacing w:before="0" w:line="240" w:lineRule="auto"/>
-              <w:ind w:right="-360"/>
-              <w:rPr>
-                <w:rFonts w:ascii="Times New Roman" w:hAnsi="Times New Roman"/>
-                <w:b/>
-                <w:szCs w:val="22"/>
-              </w:rPr>
-            </w:pPr>
-          </w:p>
-        </w:tc>
-        <w:tc>
-          <w:tcPr>
-            <w:tcW w:w="9554" w:type="dxa"/>
-          </w:tcPr>
-          <w:p>
-            <w:pPr>
-              <w:spacing w:before="0" w:line="240" w:lineRule="auto"/>
-              <w:jc w:val="both"/>
-              <w:rPr>
-                <w:rFonts w:ascii="Times New Roman" w:hAnsi="Times New Roman"/>
-                <w:b/>
-                <w:color w:val="000000" w:themeColor="text1"/>
-                <w:szCs w:val="22"/>
-              </w:rPr>
-            </w:pPr>
-          </w:p>
-        </w:tc>
-      </w:tr>
-    </w:tbl>
-    <w:p>
-      <w:pPr>
-        <w:spacing w:before="0"/>
-      </w:pPr>
-    </w:p>
-    <w:tbl>
-      <w:tblPr>
-        <w:tblStyle w:val="TableGrid"/>
-        <w:tblW w:w="10530" w:type="dxa"/>
-        <w:tblInd w:w="-612" w:type="dxa"/>
-        <w:tblBorders>
-          <w:top w:val="single" w:sz="4" w:space="0" w:color="auto"/>
-          <w:left w:val="single" w:sz="4" w:space="0" w:color="auto"/>
-          <w:bottom w:val="single" w:sz="4" w:space="0" w:color="auto"/>
-          <w:right w:val="single" w:sz="4" w:space="0" w:color="auto"/>
-          <w:insideH w:val="single" w:sz="4" w:space="0" w:color="auto"/>
-          <w:insideV w:val="single" w:sz="4" w:space="0" w:color="auto"/>
-        </w:tblBorders>
-        <w:tblLook w:val="04A0" w:firstRow="1" w:lastRow="0" w:firstColumn="1" w:lastColumn="0" w:noHBand="0" w:noVBand="1"/>
-      </w:tblPr>
-      <w:tblGrid>
-        <w:gridCol w:w="990"/>
-        <w:gridCol w:w="7296"/>
-        <w:gridCol w:w="2244"/>
-      </w:tblGrid>
-      <w:tr>
-        <w:trPr>
-          <w:trHeight w:val="288"/>
-          <w:tblHeader/>
-        </w:trPr>
-        <w:tc>
-          <w:tcPr>
-            <w:tcW w:w="990" w:type="dxa"/>
-          </w:tcPr>
-          <w:p>
-            <w:pPr>
-              <w:pStyle w:val="ListParagraph"/>
-              <w:numPr>
-                <w:ilvl w:val="0"/>
-                <w:numId w:val="18"/>
-              </w:numPr>
-              <w:spacing w:before="0" w:line="240" w:lineRule="auto"/>
-              <w:ind w:right="-360"/>
-              <w:rPr>
-                <w:rFonts w:ascii="Times New Roman" w:hAnsi="Times New Roman"/>
-                <w:szCs w:val="22"/>
-              </w:rPr>
-            </w:pPr>
-          </w:p>
-        </w:tc>
-        <w:tc>
-          <w:tcPr>
-            <w:tcW w:w="7296" w:type="dxa"/>
-          </w:tcPr>
-          <w:p>
-            <w:pPr>
-              <w:spacing w:before="0" w:line="240" w:lineRule="auto"/>
-              <w:ind w:right="-360"/>
-              <w:rPr>
-                <w:rFonts w:ascii="Times New Roman" w:hAnsi="Times New Roman"/>
-                <w:szCs w:val="22"/>
-              </w:rPr>
-            </w:pPr>
-            <w:r>
-              <w:rPr>
-                <w:rFonts w:ascii="Times New Roman" w:hAnsi="Times New Roman"/>
-                <w:b/>
-                <w:szCs w:val="22"/>
-              </w:rPr>
-              <w:t>Procedure:</w:t>
-            </w:r>
-          </w:p>
-        </w:tc>
-        <w:tc>
-          <w:tcPr>
-            <w:tcW w:w="2244" w:type="dxa"/>
-          </w:tcPr>
-          <w:p>
-            <w:pPr>
-              <w:spacing w:before="0" w:line="240" w:lineRule="auto"/>
-              <w:ind w:left="-119" w:right="-104"/>
-              <w:jc w:val="center"/>
-              <w:rPr>
-                <w:rFonts w:ascii="Times New Roman" w:hAnsi="Times New Roman"/>
-                <w:b/>
-                <w:szCs w:val="22"/>
-              </w:rPr>
-            </w:pPr>
-            <w:r>
-              <w:rPr>
-                <w:rFonts w:ascii="Times New Roman" w:hAnsi="Times New Roman"/>
-                <w:b/>
-                <w:szCs w:val="22"/>
-              </w:rPr>
-              <w:t>Responsibility</w:t>
-            </w:r>
-          </w:p>
-        </w:tc>
-      </w:tr>
-      <w:tr>
-        <w:trPr>
-          <w:trHeight w:val="288"/>
-        </w:trPr>
-        <w:tc>
-          <w:tcPr>
-            <w:tcW w:w="990" w:type="dxa"/>
-          </w:tcPr>
-          <w:p>
-            <w:pPr>
-              <w:pStyle w:val="ListParagraph"/>
-              <w:numPr>
-                <w:ilvl w:val="1"/>
-                <w:numId w:val="18"/>
-              </w:numPr>
-              <w:spacing w:before="0" w:line="240" w:lineRule="auto"/>
-              <w:ind w:right="-360"/>
-              <w:rPr>
-                <w:rFonts w:ascii="Times New Roman" w:hAnsi="Times New Roman"/>
-                <w:b/>
-                <w:szCs w:val="22"/>
-              </w:rPr>
-            </w:pPr>
-          </w:p>
-        </w:tc>
-        <w:tc>
-          <w:tcPr>
-            <w:tcW w:w="9540" w:type="dxa"/>
-            <w:gridSpan w:val="2"/>
-          </w:tcPr>
-          <w:p>
-            <w:pPr>
-              <w:spacing w:before="0" w:line="240" w:lineRule="auto"/>
-              <w:ind w:right="-360"/>
-              <w:rPr>
-                <w:rFonts w:ascii="Times New Roman" w:hAnsi="Times New Roman"/>
-                <w:b/>
-                <w:szCs w:val="22"/>
-              </w:rPr>
-            </w:pPr>
-          </w:p>
-        </w:tc>
-      </w:tr>
-      <w:tr>
-        <w:trPr>
-          <w:trHeight w:val="288"/>
-        </w:trPr>
-        <w:tc>
-          <w:tcPr>
-            <w:tcW w:w="990" w:type="dxa"/>
-          </w:tcPr>
-          <w:p>
-            <w:pPr>
-              <w:pStyle w:val="ListParagraph"/>
-              <w:numPr>
-                <w:ilvl w:val="2"/>
-                <w:numId w:val="18"/>
-              </w:numPr>
-              <w:spacing w:before="0" w:line="240" w:lineRule="auto"/>
-              <w:ind w:right="-360"/>
-              <w:rPr>
-                <w:rFonts w:ascii="Times New Roman" w:hAnsi="Times New Roman"/>
-                <w:szCs w:val="22"/>
-              </w:rPr>
-            </w:pPr>
-          </w:p>
-        </w:tc>
-        <w:tc>
-          <w:tcPr>
-            <w:tcW w:w="7296" w:type="dxa"/>
-          </w:tcPr>
-          <w:p>
-            <w:pPr>
-              <w:spacing w:before="0" w:line="240" w:lineRule="auto"/>
-              <w:jc w:val="both"/>
-              <w:rPr>
-                <w:rFonts w:ascii="Times New Roman" w:hAnsi="Times New Roman"/>
-                <w:color w:val="000000" w:themeColor="text1"/>
-                <w:szCs w:val="22"/>
-              </w:rPr>
-            </w:pPr>
-          </w:p>
-        </w:tc>
-        <w:tc>
-          <w:tcPr>
-            <w:tcW w:w="2244" w:type="dxa"/>
-          </w:tcPr>
-          <w:p>
-            <w:pPr>
-              <w:spacing w:before="0" w:line="240" w:lineRule="auto"/>
-              <w:jc w:val="both"/>
-              <w:rPr>
-                <w:rFonts w:ascii="Times New Roman" w:hAnsi="Times New Roman"/>
-                <w:color w:val="000000" w:themeColor="text1"/>
-                <w:szCs w:val="22"/>
-              </w:rPr>
-            </w:pPr>
-          </w:p>
-        </w:tc>
-      </w:tr>
-    </w:tbl>
-    <w:p/>
-    <w:tbl>
-      <w:tblPr>
-        <w:tblStyle w:val="TableGrid"/>
-        <w:tblW w:w="10530" w:type="dxa"/>
-        <w:tblInd w:w="-612" w:type="dxa"/>
-        <w:tblBorders>
-          <w:top w:val="single" w:sz="4" w:space="0" w:color="auto"/>
-          <w:left w:val="single" w:sz="4" w:space="0" w:color="auto"/>
-          <w:bottom w:val="single" w:sz="4" w:space="0" w:color="auto"/>
-          <w:right w:val="single" w:sz="4" w:space="0" w:color="auto"/>
-          <w:insideH w:val="single" w:sz="4" w:space="0" w:color="auto"/>
-          <w:insideV w:val="single" w:sz="4" w:space="0" w:color="auto"/>
-        </w:tblBorders>
-        <w:tblLook w:val="04A0" w:firstRow="1" w:lastRow="0" w:firstColumn="1" w:lastColumn="0" w:noHBand="0" w:noVBand="1"/>
-      </w:tblPr>
-      <w:tblGrid>
-        <w:gridCol w:w="900"/>
-        <w:gridCol w:w="9630"/>
-      </w:tblGrid>
-      <w:tr>
-        <w:trPr>
-          <w:trHeight w:val="288"/>
-        </w:trPr>
-        <w:tc>
-          <w:tcPr>
-            <w:tcW w:w="900" w:type="dxa"/>
-          </w:tcPr>
-          <w:p>
-            <w:pPr>
-              <w:pStyle w:val="ListParagraph"/>
-              <w:numPr>
-                <w:ilvl w:val="0"/>
-                <w:numId w:val="39"/>
-              </w:numPr>
-              <w:spacing w:before="0" w:line="240" w:lineRule="auto"/>
-              <w:ind w:right="-360"/>
-              <w:rPr>
-                <w:rFonts w:ascii="Times New Roman" w:hAnsi="Times New Roman"/>
-                <w:szCs w:val="22"/>
-              </w:rPr>
-            </w:pPr>
-          </w:p>
-        </w:tc>
-        <w:tc>
-          <w:tcPr>
-            <w:tcW w:w="9630" w:type="dxa"/>
-          </w:tcPr>
-          <w:p>
-            <w:pPr>
-              <w:spacing w:before="0" w:line="240" w:lineRule="auto"/>
-              <w:ind w:right="-360"/>
-              <w:rPr>
-                <w:rFonts w:ascii="Times New Roman" w:hAnsi="Times New Roman"/>
-                <w:szCs w:val="22"/>
-              </w:rPr>
-            </w:pPr>
-            <w:r>
-              <w:rPr>
-                <w:rFonts w:ascii="Times New Roman" w:hAnsi="Times New Roman"/>
-                <w:b/>
-                <w:bCs/>
-                <w:szCs w:val="22"/>
-              </w:rPr>
-              <w:t>Process Flow</w:t>
-            </w:r>
-          </w:p>
-        </w:tc>
-      </w:tr>
-      <w:tr>
-        <w:trPr>
-          <w:trHeight w:val="288"/>
-        </w:trPr>
-        <w:tc>
-          <w:tcPr>
-            <w:tcW w:w="10530" w:type="dxa"/>
-            <w:gridSpan w:val="2"/>
-          </w:tcPr>
-          <w:p>
-            <w:pPr>
-              <w:spacing w:before="0" w:line="240" w:lineRule="auto"/>
-              <w:ind w:right="-166"/>
-              <w:rPr>
-                <w:rFonts w:ascii="Times New Roman" w:hAnsi="Times New Roman"/>
-                <w:b/>
-                <w:bCs/>
-                <w:szCs w:val="22"/>
-              </w:rPr>
-            </w:pPr>
-          </w:p>
-        </w:tc>
-      </w:tr>
-    </w:tbl>
-    <w:p>
-      <w:pPr>
-        <w:spacing w:before="0"/>
-      </w:pPr>
-    </w:p>
-    <w:tbl>
-      <w:tblPr>
-        <w:tblStyle w:val="TableGrid"/>
-        <w:tblW w:w="10530" w:type="dxa"/>
-        <w:tblInd w:w="-612" w:type="dxa"/>
-        <w:tblBorders>
-          <w:top w:val="single" w:sz="4" w:space="0" w:color="auto"/>
-          <w:left w:val="single" w:sz="4" w:space="0" w:color="auto"/>
-          <w:bottom w:val="single" w:sz="4" w:space="0" w:color="auto"/>
-          <w:right w:val="single" w:sz="4" w:space="0" w:color="auto"/>
-          <w:insideH w:val="single" w:sz="4" w:space="0" w:color="auto"/>
-          <w:insideV w:val="single" w:sz="4" w:space="0" w:color="auto"/>
-        </w:tblBorders>
-        <w:tblLook w:val="04A0" w:firstRow="1" w:lastRow="0" w:firstColumn="1" w:lastColumn="0" w:noHBand="0" w:noVBand="1"/>
-      </w:tblPr>
-      <w:tblGrid>
-        <w:gridCol w:w="900"/>
-        <w:gridCol w:w="2970"/>
-        <w:gridCol w:w="6660"/>
-      </w:tblGrid>
-      <w:tr>
-        <w:trPr>
-          <w:trHeight w:val="288"/>
-        </w:trPr>
-        <w:tc>
-          <w:tcPr>
-            <w:tcW w:w="900" w:type="dxa"/>
-          </w:tcPr>
-          <w:p>
-            <w:pPr>
-              <w:pStyle w:val="ListParagraph"/>
-              <w:numPr>
-                <w:ilvl w:val="0"/>
-                <w:numId w:val="39"/>
-              </w:numPr>
-              <w:spacing w:before="0" w:line="240" w:lineRule="auto"/>
-              <w:ind w:right="-360"/>
-              <w:rPr>
-                <w:rFonts w:ascii="Times New Roman" w:hAnsi="Times New Roman"/>
-                <w:szCs w:val="22"/>
-              </w:rPr>
-            </w:pPr>
-          </w:p>
-        </w:tc>
-        <w:tc>
-          <w:tcPr>
-            <w:tcW w:w="9630" w:type="dxa"/>
-            <w:gridSpan w:val="2"/>
-          </w:tcPr>
-          <w:p>
-            <w:pPr>
-              <w:spacing w:before="0" w:line="240" w:lineRule="auto"/>
-              <w:ind w:right="-360"/>
-              <w:rPr>
-                <w:rFonts w:ascii="Times New Roman" w:hAnsi="Times New Roman"/>
-                <w:szCs w:val="22"/>
-              </w:rPr>
-            </w:pPr>
-            <w:r>
-              <w:rPr>
-                <w:rFonts w:ascii="Times New Roman" w:hAnsi="Times New Roman"/>
-                <w:b/>
-                <w:bCs/>
-                <w:szCs w:val="22"/>
-              </w:rPr>
-              <w:t>Definition</w:t>
-            </w:r>
-            <w:r>
-              <w:rPr>
-                <w:rFonts w:ascii="Times New Roman" w:hAnsi="Times New Roman"/>
-                <w:b/>
-                <w:szCs w:val="22"/>
-              </w:rPr>
-              <w:t xml:space="preserve"> / Abbreviation:</w:t>
-            </w:r>
-          </w:p>
-        </w:tc>
-      </w:tr>
-      <w:tr>
-        <w:trPr>
-          <w:trHeight w:val="288"/>
-        </w:trPr>
-        <w:tc>
-          <w:tcPr>
-            <w:tcW w:w="900" w:type="dxa"/>
-          </w:tcPr>
-          <w:p>
-            <w:pPr>
-              <w:spacing w:before="0" w:line="240" w:lineRule="auto"/>
-              <w:ind w:right="-360"/>
-              <w:rPr>
-                <w:rFonts w:ascii="Times New Roman" w:hAnsi="Times New Roman"/>
-                <w:szCs w:val="22"/>
-              </w:rPr>
-            </w:pPr>
-            <w:r>
-              <w:rPr>
-                <w:rFonts w:ascii="Times New Roman" w:hAnsi="Times New Roman"/>
-                <w:b/>
-                <w:bCs/>
-                <w:szCs w:val="22"/>
-              </w:rPr>
-              <w:t>S. No.</w:t>
-            </w:r>
-          </w:p>
-        </w:tc>
-        <w:tc>
-          <w:tcPr>
-            <w:tcW w:w="2970" w:type="dxa"/>
-            <w:vAlign w:val="center"/>
-          </w:tcPr>
-          <w:p>
-            <w:pPr>
-              <w:spacing w:before="0" w:line="240" w:lineRule="auto"/>
-              <w:ind w:left="-43" w:right="-166"/>
-              <w:jc w:val="center"/>
-              <w:rPr>
-                <w:rFonts w:ascii="Times New Roman" w:hAnsi="Times New Roman"/>
-                <w:b/>
-                <w:bCs/>
-                <w:szCs w:val="22"/>
-              </w:rPr>
-            </w:pPr>
-            <w:r>
-              <w:rPr>
-                <w:rFonts w:ascii="Times New Roman" w:hAnsi="Times New Roman"/>
-                <w:b/>
-                <w:bCs/>
-                <w:szCs w:val="22"/>
-              </w:rPr>
-              <w:t>Term/word/statement</w:t>
-            </w:r>
-          </w:p>
-        </w:tc>
-        <w:tc>
-          <w:tcPr>
-            <w:tcW w:w="6660" w:type="dxa"/>
-            <w:vAlign w:val="center"/>
-          </w:tcPr>
-          <w:p>
-            <w:pPr>
-              <w:spacing w:before="0" w:line="240" w:lineRule="auto"/>
-              <w:ind w:left="-43" w:right="-166"/>
-              <w:jc w:val="center"/>
-              <w:rPr>
-                <w:rFonts w:ascii="Times New Roman" w:hAnsi="Times New Roman"/>
-                <w:b/>
-                <w:bCs/>
-                <w:szCs w:val="22"/>
-              </w:rPr>
-            </w:pPr>
-            <w:r>
-              <w:rPr>
-                <w:rFonts w:ascii="Times New Roman" w:hAnsi="Times New Roman"/>
-                <w:b/>
-                <w:bCs/>
-                <w:szCs w:val="22"/>
-              </w:rPr>
-              <w:t>Meaning/Description</w:t>
-            </w:r>
-          </w:p>
-        </w:tc>
-      </w:tr>
-      <w:tr>
-        <w:trPr>
-          <w:trHeight w:val="288"/>
-        </w:trPr>
-        <w:tc>
-          <w:tcPr>
-            <w:tcW w:w="900" w:type="dxa"/>
-          </w:tcPr>
-          <w:p>
-            <w:pPr>
-              <w:spacing w:before="0" w:line="240" w:lineRule="auto"/>
-              <w:ind w:left="-100" w:right="-113"/>
-              <w:jc w:val="center"/>
-              <w:rPr>
-                <w:rFonts w:ascii="Times New Roman" w:hAnsi="Times New Roman"/>
-                <w:szCs w:val="22"/>
-              </w:rPr>
-            </w:pPr>
-          </w:p>
-        </w:tc>
-        <w:tc>
-          <w:tcPr>
-            <w:tcW w:w="2970" w:type="dxa"/>
-          </w:tcPr>
-          <w:p>
-            <w:pPr>
-              <w:tabs>
-                <w:tab w:val="left" w:pos="1800"/>
-              </w:tabs>
-              <w:spacing w:before="0" w:line="240" w:lineRule="auto"/>
-              <w:jc w:val="center"/>
-              <w:rPr>
-                <w:rFonts w:ascii="Times New Roman" w:hAnsi="Times New Roman"/>
-                <w:szCs w:val="22"/>
-              </w:rPr>
-            </w:pPr>
-          </w:p>
-        </w:tc>
-        <w:tc>
-          <w:tcPr>
-            <w:tcW w:w="6660" w:type="dxa"/>
-          </w:tcPr>
-          <w:p>
-            <w:pPr>
-              <w:spacing w:before="0" w:line="240" w:lineRule="auto"/>
-              <w:ind w:right="-360"/>
-              <w:jc w:val="center"/>
-              <w:rPr>
-                <w:rFonts w:ascii="Times New Roman" w:hAnsi="Times New Roman"/>
-                <w:szCs w:val="22"/>
-              </w:rPr>
-            </w:pPr>
-          </w:p>
-        </w:tc>
-      </w:tr>
-    </w:tbl>
-    <w:p>
-      <w:pPr>
-        <w:spacing w:before="0"/>
-      </w:pPr>
-    </w:p>
-    <w:tbl>
-      <w:tblPr>
-        <w:tblStyle w:val="TableGrid"/>
-        <w:tblW w:w="10530" w:type="dxa"/>
-        <w:tblInd w:w="-612" w:type="dxa"/>
-        <w:tblBorders>
-          <w:top w:val="single" w:sz="4" w:space="0" w:color="auto"/>
-          <w:left w:val="single" w:sz="4" w:space="0" w:color="auto"/>
-          <w:bottom w:val="single" w:sz="4" w:space="0" w:color="auto"/>
-          <w:right w:val="single" w:sz="4" w:space="0" w:color="auto"/>
-          <w:insideH w:val="single" w:sz="4" w:space="0" w:color="auto"/>
-          <w:insideV w:val="single" w:sz="4" w:space="0" w:color="auto"/>
-        </w:tblBorders>
-        <w:tblLook w:val="04A0" w:firstRow="1" w:lastRow="0" w:firstColumn="1" w:lastColumn="0" w:noHBand="0" w:noVBand="1"/>
-      </w:tblPr>
-      <w:tblGrid>
-        <w:gridCol w:w="900"/>
-        <w:gridCol w:w="9630"/>
-      </w:tblGrid>
-      <w:tr>
-        <w:trPr>
-          <w:trHeight w:val="288"/>
-        </w:trPr>
-        <w:tc>
-          <w:tcPr>
-            <w:tcW w:w="900" w:type="dxa"/>
-          </w:tcPr>
-          <w:p>
-            <w:pPr>
-              <w:spacing w:before="0" w:line="240" w:lineRule="auto"/>
-              <w:ind w:right="-360"/>
-              <w:rPr>
-                <w:rFonts w:ascii="Times New Roman" w:hAnsi="Times New Roman"/>
-                <w:b/>
-                <w:bCs/>
-                <w:szCs w:val="22"/>
-              </w:rPr>
-            </w:pPr>
-            <w:r>
-              <w:rPr>
-                <w:rFonts w:ascii="Times New Roman" w:hAnsi="Times New Roman"/>
-                <w:b/>
-                <w:bCs/>
-                <w:szCs w:val="22"/>
-              </w:rPr>
-              <w:t>8</w:t>
-            </w:r>
-            <w:r>
-              <w:rPr>
-                <w:rFonts w:ascii="Times New Roman" w:hAnsi="Times New Roman"/>
-                <w:b/>
-                <w:bCs/>
-                <w:szCs w:val="22"/>
-              </w:rPr>
-              <w:t>.0.</w:t>
-            </w:r>
-          </w:p>
-        </w:tc>
-        <w:tc>
-          <w:tcPr>
-            <w:tcW w:w="9630" w:type="dxa"/>
-          </w:tcPr>
-          <w:p>
-            <w:pPr>
-              <w:spacing w:before="0" w:line="240" w:lineRule="auto"/>
-              <w:ind w:right="-360"/>
-              <w:rPr>
-                <w:rFonts w:ascii="Times New Roman" w:hAnsi="Times New Roman"/>
-                <w:szCs w:val="22"/>
-              </w:rPr>
-            </w:pPr>
-            <w:r>
-              <w:rPr>
-                <w:rFonts w:ascii="Times New Roman" w:hAnsi="Times New Roman"/>
-                <w:b/>
-                <w:bCs/>
-                <w:szCs w:val="22"/>
-              </w:rPr>
-              <w:t>References</w:t>
-            </w:r>
-            <w:r>
-              <w:rPr>
-                <w:rFonts w:ascii="Times New Roman" w:hAnsi="Times New Roman"/>
-                <w:b/>
-                <w:szCs w:val="22"/>
-              </w:rPr>
-              <w:t xml:space="preserve"> Used:</w:t>
-            </w:r>
-          </w:p>
-        </w:tc>
-      </w:tr>
-      <w:tr>
-        <w:trPr>
-          <w:trHeight w:val="288"/>
-        </w:trPr>
-        <w:tc>
-          <w:tcPr>
-            <w:tcW w:w="900" w:type="dxa"/>
-          </w:tcPr>
-          <w:p>
-            <w:pPr>
-              <w:spacing w:before="0" w:line="240" w:lineRule="auto"/>
-              <w:ind w:right="-360"/>
-              <w:rPr>
-                <w:rFonts w:ascii="Times New Roman" w:hAnsi="Times New Roman"/>
-                <w:szCs w:val="22"/>
-              </w:rPr>
-            </w:pPr>
-            <w:r>
-              <w:rPr>
-                <w:rFonts w:ascii="Times New Roman" w:hAnsi="Times New Roman"/>
-                <w:b/>
-                <w:bCs/>
-                <w:szCs w:val="22"/>
-              </w:rPr>
-              <w:t>S. No.</w:t>
-            </w:r>
-          </w:p>
-        </w:tc>
-        <w:tc>
-          <w:tcPr>
-            <w:tcW w:w="9630" w:type="dxa"/>
-            <w:vAlign w:val="center"/>
-          </w:tcPr>
-          <w:p>
-            <w:pPr>
-              <w:spacing w:before="0" w:line="240" w:lineRule="auto"/>
-              <w:ind w:left="-43" w:right="-166"/>
-              <w:rPr>
-                <w:rFonts w:ascii="Times New Roman" w:hAnsi="Times New Roman"/>
-                <w:b/>
-                <w:bCs/>
-                <w:szCs w:val="22"/>
-              </w:rPr>
-            </w:pPr>
-            <w:r>
-              <w:rPr>
-                <w:rFonts w:ascii="Times New Roman" w:hAnsi="Times New Roman"/>
-                <w:b/>
-                <w:bCs/>
-                <w:szCs w:val="22"/>
-              </w:rPr>
-              <w:t>Description</w:t>
-            </w:r>
-          </w:p>
-        </w:tc>
-      </w:tr>
-      <w:tr>
-        <w:trPr>
-          <w:trHeight w:val="288"/>
-        </w:trPr>
-        <w:tc>
-          <w:tcPr>
-            <w:tcW w:w="900" w:type="dxa"/>
-          </w:tcPr>
-          <w:p>
-            <w:pPr>
-              <w:spacing w:before="0" w:line="240" w:lineRule="auto"/>
-              <w:ind w:right="-360"/>
-              <w:rPr>
-                <w:rFonts w:ascii="Times New Roman" w:hAnsi="Times New Roman"/>
-                <w:b/>
-                <w:szCs w:val="22"/>
-              </w:rPr>
-            </w:pPr>
-            <w:r>
-              <w:rPr>
-                <w:rFonts w:ascii="Times New Roman" w:hAnsi="Times New Roman"/>
-                <w:b/>
-                <w:szCs w:val="22"/>
-              </w:rPr>
-              <w:t>9</w:t>
-            </w:r>
-            <w:r>
-              <w:rPr>
-                <w:rFonts w:ascii="Times New Roman" w:hAnsi="Times New Roman"/>
-                <w:b/>
-                <w:szCs w:val="22"/>
-              </w:rPr>
-              <w:t>.1.</w:t>
-            </w:r>
-          </w:p>
-        </w:tc>
-        <w:tc>
-          <w:tcPr>
-            <w:tcW w:w="9630" w:type="dxa"/>
-          </w:tcPr>
-          <w:p>
-            <w:pPr>
-              <w:spacing w:before="0" w:line="240" w:lineRule="auto"/>
-              <w:ind w:right="-360"/>
-              <w:rPr>
-                <w:rFonts w:ascii="Times New Roman" w:hAnsi="Times New Roman"/>
-                <w:szCs w:val="22"/>
-              </w:rPr>
-            </w:pPr>
-          </w:p>
-        </w:tc>
-      </w:tr>
-    </w:tbl>
-    <w:p>
-      <w:pPr>
-        <w:spacing w:before="0"/>
-      </w:pPr>
-    </w:p>
-    <w:tbl>
-      <w:tblPr>
-        <w:tblStyle w:val="TableGrid"/>
-        <w:tblW w:w="10530" w:type="dxa"/>
-        <w:tblInd w:w="-612" w:type="dxa"/>
-        <w:tblBorders>
-          <w:top w:val="single" w:sz="4" w:space="0" w:color="auto"/>
-          <w:left w:val="single" w:sz="4" w:space="0" w:color="auto"/>
-          <w:bottom w:val="single" w:sz="4" w:space="0" w:color="auto"/>
-          <w:right w:val="single" w:sz="4" w:space="0" w:color="auto"/>
-          <w:insideH w:val="single" w:sz="4" w:space="0" w:color="auto"/>
-          <w:insideV w:val="single" w:sz="4" w:space="0" w:color="auto"/>
-        </w:tblBorders>
-        <w:tblLook w:val="04A0" w:firstRow="1" w:lastRow="0" w:firstColumn="1" w:lastColumn="0" w:noHBand="0" w:noVBand="1"/>
-      </w:tblPr>
-      <w:tblGrid>
-        <w:gridCol w:w="900"/>
-        <w:gridCol w:w="2970"/>
-        <w:gridCol w:w="6660"/>
-      </w:tblGrid>
-      <w:tr>
-        <w:trPr>
-          <w:trHeight w:val="288"/>
-        </w:trPr>
-        <w:tc>
-          <w:tcPr>
-            <w:tcW w:w="900" w:type="dxa"/>
-          </w:tcPr>
-          <w:p>
-            <w:pPr>
-              <w:spacing w:before="0" w:line="240" w:lineRule="auto"/>
-              <w:ind w:right="-360"/>
-              <w:rPr>
-                <w:rFonts w:ascii="Times New Roman" w:hAnsi="Times New Roman"/>
-                <w:szCs w:val="22"/>
-              </w:rPr>
-            </w:pPr>
-            <w:r>
-              <w:rPr>
-                <w:rFonts w:ascii="Times New Roman" w:hAnsi="Times New Roman"/>
-                <w:b/>
-                <w:bCs/>
-                <w:szCs w:val="22"/>
-              </w:rPr>
-              <w:t>9</w:t>
-            </w:r>
-            <w:r>
-              <w:rPr>
-                <w:rFonts w:ascii="Times New Roman" w:hAnsi="Times New Roman"/>
-                <w:b/>
-                <w:bCs/>
-                <w:szCs w:val="22"/>
-              </w:rPr>
-              <w:t>.0</w:t>
-            </w:r>
-            <w:r>
-              <w:rPr>
-                <w:rFonts w:ascii="Times New Roman" w:hAnsi="Times New Roman"/>
-                <w:szCs w:val="22"/>
-              </w:rPr>
-              <w:t xml:space="preserve">. </w:t>
-            </w:r>
-          </w:p>
-        </w:tc>
-        <w:tc>
-          <w:tcPr>
-            <w:tcW w:w="9630" w:type="dxa"/>
-            <w:gridSpan w:val="2"/>
-          </w:tcPr>
-          <w:p>
-            <w:pPr>
-              <w:spacing w:before="0" w:line="240" w:lineRule="auto"/>
-              <w:ind w:right="-360"/>
-              <w:rPr>
-                <w:rFonts w:ascii="Times New Roman" w:hAnsi="Times New Roman"/>
-                <w:szCs w:val="22"/>
-              </w:rPr>
-            </w:pPr>
-            <w:r>
-              <w:rPr>
-                <w:rFonts w:ascii="Times New Roman" w:hAnsi="Times New Roman"/>
-                <w:b/>
-                <w:bCs/>
-                <w:szCs w:val="22"/>
-              </w:rPr>
-              <w:t>Referred Documents</w:t>
-            </w:r>
-            <w:r>
-              <w:rPr>
-                <w:rFonts w:ascii="Times New Roman" w:hAnsi="Times New Roman"/>
-                <w:b/>
-                <w:szCs w:val="22"/>
-              </w:rPr>
-              <w:t>:</w:t>
-            </w:r>
-          </w:p>
-        </w:tc>
-      </w:tr>
-      <w:tr>
-        <w:trPr>
-          <w:trHeight w:val="288"/>
-        </w:trPr>
-        <w:tc>
-          <w:tcPr>
-            <w:tcW w:w="900" w:type="dxa"/>
-          </w:tcPr>
-          <w:p>
-            <w:pPr>
-              <w:spacing w:before="0" w:line="240" w:lineRule="auto"/>
-              <w:ind w:right="-360"/>
-              <w:rPr>
-                <w:rFonts w:ascii="Times New Roman" w:hAnsi="Times New Roman"/>
-                <w:szCs w:val="22"/>
-              </w:rPr>
-            </w:pPr>
-            <w:r>
-              <w:rPr>
-                <w:rFonts w:ascii="Times New Roman" w:hAnsi="Times New Roman"/>
-                <w:b/>
-                <w:bCs/>
-                <w:szCs w:val="22"/>
-              </w:rPr>
-              <w:t>S. No.</w:t>
-            </w:r>
-          </w:p>
-        </w:tc>
-        <w:tc>
-          <w:tcPr>
-            <w:tcW w:w="2970" w:type="dxa"/>
-          </w:tcPr>
-          <w:p>
-            <w:pPr>
-              <w:spacing w:before="0" w:line="240" w:lineRule="auto"/>
-              <w:ind w:left="-43" w:right="-166"/>
-              <w:jc w:val="center"/>
-              <w:rPr>
-                <w:rFonts w:ascii="Times New Roman" w:hAnsi="Times New Roman"/>
-                <w:b/>
-                <w:bCs/>
-                <w:szCs w:val="22"/>
-              </w:rPr>
-            </w:pPr>
-            <w:r>
-              <w:rPr>
-                <w:rFonts w:ascii="Times New Roman" w:hAnsi="Times New Roman"/>
-                <w:b/>
-                <w:bCs/>
-                <w:szCs w:val="22"/>
-              </w:rPr>
-              <w:t>Document No.</w:t>
-            </w:r>
-          </w:p>
-        </w:tc>
-        <w:tc>
-          <w:tcPr>
-            <w:tcW w:w="6660" w:type="dxa"/>
-          </w:tcPr>
-          <w:p>
-            <w:pPr>
-              <w:spacing w:before="0" w:line="240" w:lineRule="auto"/>
-              <w:ind w:left="-43" w:right="-166"/>
-              <w:jc w:val="center"/>
-              <w:rPr>
-                <w:rFonts w:ascii="Times New Roman" w:hAnsi="Times New Roman"/>
-                <w:b/>
-                <w:bCs/>
-                <w:szCs w:val="22"/>
-              </w:rPr>
-            </w:pPr>
-            <w:r>
-              <w:rPr>
-                <w:rFonts w:ascii="Times New Roman" w:hAnsi="Times New Roman"/>
-                <w:b/>
-                <w:bCs/>
-                <w:szCs w:val="22"/>
-              </w:rPr>
-              <w:t>Description</w:t>
-            </w:r>
-          </w:p>
-        </w:tc>
-      </w:tr>
-      <w:tr>
-        <w:trPr>
-          <w:trHeight w:val="288"/>
-        </w:trPr>
-        <w:tc>
-          <w:tcPr>
-            <w:tcW w:w="900" w:type="dxa"/>
-          </w:tcPr>
-          <w:p>
-            <w:pPr>
-              <w:spacing w:before="0" w:line="240" w:lineRule="auto"/>
-              <w:ind w:right="-360"/>
-              <w:rPr>
-                <w:rFonts w:ascii="Times New Roman" w:hAnsi="Times New Roman"/>
-                <w:b/>
-                <w:szCs w:val="22"/>
-              </w:rPr>
-            </w:pPr>
-            <w:r>
-              <w:rPr>
-                <w:rFonts w:ascii="Times New Roman" w:hAnsi="Times New Roman"/>
-                <w:b/>
-                <w:szCs w:val="22"/>
-              </w:rPr>
-              <w:t>10</w:t>
-            </w:r>
-            <w:r>
-              <w:rPr>
-                <w:rFonts w:ascii="Times New Roman" w:hAnsi="Times New Roman"/>
-                <w:b/>
-                <w:szCs w:val="22"/>
-              </w:rPr>
-              <w:t>.1.</w:t>
-            </w:r>
-          </w:p>
-        </w:tc>
-        <w:tc>
-          <w:tcPr>
-            <w:tcW w:w="2970" w:type="dxa"/>
-          </w:tcPr>
-          <w:p>
-            <w:pPr>
-              <w:tabs>
-                <w:tab w:val="left" w:pos="1800"/>
-              </w:tabs>
-              <w:spacing w:before="0" w:line="240" w:lineRule="auto"/>
-              <w:jc w:val="center"/>
-              <w:rPr>
-                <w:rFonts w:ascii="Times New Roman" w:hAnsi="Times New Roman"/>
-                <w:szCs w:val="22"/>
-              </w:rPr>
-            </w:pPr>
-          </w:p>
-        </w:tc>
-        <w:tc>
-          <w:tcPr>
-            <w:tcW w:w="6660" w:type="dxa"/>
-          </w:tcPr>
-          <w:p>
-            <w:pPr>
-              <w:spacing w:before="0" w:line="240" w:lineRule="auto"/>
-              <w:ind w:right="-360"/>
-              <w:jc w:val="center"/>
-              <w:rPr>
-                <w:rFonts w:ascii="Times New Roman" w:hAnsi="Times New Roman"/>
-                <w:szCs w:val="22"/>
-              </w:rPr>
-            </w:pPr>
-          </w:p>
-        </w:tc>
-      </w:tr>
-    </w:tbl>
-    <w:p>
-      <w:pPr>
-        <w:spacing w:before="0"/>
-      </w:pPr>
-    </w:p>
-    <w:tbl>
-      <w:tblPr>
-        <w:tblStyle w:val="TableGrid"/>
-        <w:tblW w:w="10530" w:type="dxa"/>
-        <w:tblInd w:w="-612" w:type="dxa"/>
-        <w:tblBorders>
-          <w:top w:val="single" w:sz="4" w:space="0" w:color="auto"/>
-          <w:left w:val="single" w:sz="4" w:space="0" w:color="auto"/>
-          <w:bottom w:val="single" w:sz="4" w:space="0" w:color="auto"/>
-          <w:right w:val="single" w:sz="4" w:space="0" w:color="auto"/>
-          <w:insideH w:val="single" w:sz="4" w:space="0" w:color="auto"/>
-          <w:insideV w:val="single" w:sz="4" w:space="0" w:color="auto"/>
-        </w:tblBorders>
-        <w:tblLook w:val="04A0" w:firstRow="1" w:lastRow="0" w:firstColumn="1" w:lastColumn="0" w:noHBand="0" w:noVBand="1"/>
-      </w:tblPr>
-      <w:tblGrid>
-        <w:gridCol w:w="900"/>
-        <w:gridCol w:w="2970"/>
-        <w:gridCol w:w="6660"/>
-      </w:tblGrid>
-      <w:tr>
-        <w:trPr>
-          <w:trHeight w:val="288"/>
-        </w:trPr>
-        <w:tc>
-          <w:tcPr>
-            <w:tcW w:w="900" w:type="dxa"/>
-          </w:tcPr>
-          <w:p>
-            <w:pPr>
-              <w:spacing w:before="0" w:line="240" w:lineRule="auto"/>
-              <w:ind w:right="-360"/>
-              <w:rPr>
-                <w:rFonts w:ascii="Times New Roman" w:hAnsi="Times New Roman"/>
-                <w:b/>
-                <w:bCs/>
-                <w:szCs w:val="22"/>
-              </w:rPr>
-            </w:pPr>
-            <w:r>
-              <w:rPr>
-                <w:rFonts w:ascii="Times New Roman" w:hAnsi="Times New Roman"/>
-                <w:b/>
-                <w:bCs/>
-                <w:szCs w:val="22"/>
-              </w:rPr>
-              <w:t>1</w:t>
-            </w:r>
-            <w:r>
-              <w:rPr>
-                <w:rFonts w:ascii="Times New Roman" w:hAnsi="Times New Roman"/>
-                <w:b/>
-                <w:bCs/>
-                <w:szCs w:val="22"/>
-              </w:rPr>
-              <w:t>0</w:t>
-            </w:r>
-            <w:r>
-              <w:rPr>
-                <w:rFonts w:ascii="Times New Roman" w:hAnsi="Times New Roman"/>
-                <w:b/>
-                <w:bCs/>
-                <w:szCs w:val="22"/>
-              </w:rPr>
-              <w:t>.0.</w:t>
-            </w:r>
-          </w:p>
-        </w:tc>
-        <w:tc>
-          <w:tcPr>
-            <w:tcW w:w="9630" w:type="dxa"/>
-            <w:gridSpan w:val="2"/>
-          </w:tcPr>
-          <w:p>
-            <w:pPr>
-              <w:spacing w:before="0" w:line="240" w:lineRule="auto"/>
-              <w:ind w:right="-360"/>
-              <w:rPr>
-                <w:rFonts w:ascii="Times New Roman" w:hAnsi="Times New Roman"/>
-                <w:szCs w:val="22"/>
-              </w:rPr>
-            </w:pPr>
-            <w:r>
-              <w:rPr>
-                <w:rFonts w:ascii="Times New Roman" w:hAnsi="Times New Roman"/>
-                <w:b/>
-                <w:szCs w:val="22"/>
-              </w:rPr>
-              <w:t>Formats:</w:t>
-            </w:r>
-          </w:p>
-        </w:tc>
-      </w:tr>
-      <w:tr>
-        <w:trPr>
-          <w:trHeight w:val="288"/>
-        </w:trPr>
-        <w:tc>
-          <w:tcPr>
-            <w:tcW w:w="900" w:type="dxa"/>
-          </w:tcPr>
-          <w:p>
-            <w:pPr>
-              <w:spacing w:before="0" w:line="240" w:lineRule="auto"/>
-              <w:ind w:right="-360"/>
-              <w:rPr>
-                <w:rFonts w:ascii="Times New Roman" w:hAnsi="Times New Roman"/>
-                <w:szCs w:val="22"/>
-              </w:rPr>
-            </w:pPr>
-            <w:r>
-              <w:rPr>
-                <w:rFonts w:ascii="Times New Roman" w:hAnsi="Times New Roman"/>
-                <w:b/>
-                <w:bCs/>
-                <w:szCs w:val="22"/>
-              </w:rPr>
-              <w:lastRenderedPageBreak/>
-              <w:t>S. No.</w:t>
-            </w:r>
-          </w:p>
-        </w:tc>
-        <w:tc>
-          <w:tcPr>
-            <w:tcW w:w="2970" w:type="dxa"/>
-          </w:tcPr>
-          <w:p>
-            <w:pPr>
-              <w:spacing w:before="0" w:line="240" w:lineRule="auto"/>
-              <w:ind w:left="-43" w:right="-166"/>
-              <w:jc w:val="center"/>
-              <w:rPr>
-                <w:rFonts w:ascii="Times New Roman" w:hAnsi="Times New Roman"/>
-                <w:b/>
-                <w:bCs/>
-                <w:szCs w:val="22"/>
-              </w:rPr>
-            </w:pPr>
-            <w:r>
-              <w:rPr>
-                <w:rFonts w:ascii="Times New Roman" w:hAnsi="Times New Roman"/>
-                <w:b/>
-                <w:bCs/>
-                <w:szCs w:val="22"/>
-              </w:rPr>
-              <w:t>Document No.</w:t>
-            </w:r>
-          </w:p>
-        </w:tc>
-        <w:tc>
-          <w:tcPr>
-            <w:tcW w:w="6660" w:type="dxa"/>
-          </w:tcPr>
-          <w:p>
-            <w:pPr>
-              <w:spacing w:before="0" w:line="240" w:lineRule="auto"/>
-              <w:ind w:left="-43" w:right="-166"/>
-              <w:jc w:val="center"/>
-              <w:rPr>
-                <w:rFonts w:ascii="Times New Roman" w:hAnsi="Times New Roman"/>
-                <w:b/>
-                <w:bCs/>
-                <w:szCs w:val="22"/>
-              </w:rPr>
-            </w:pPr>
-            <w:r>
-              <w:rPr>
-                <w:rFonts w:ascii="Times New Roman" w:hAnsi="Times New Roman"/>
-                <w:b/>
-                <w:bCs/>
-                <w:szCs w:val="22"/>
-              </w:rPr>
-              <w:t>Description</w:t>
-            </w:r>
-          </w:p>
-        </w:tc>
-      </w:tr>
-      <w:tr>
-        <w:trPr>
-          <w:trHeight w:val="288"/>
-        </w:trPr>
-        <w:tc>
-          <w:tcPr>
-            <w:tcW w:w="900" w:type="dxa"/>
-          </w:tcPr>
-          <w:p>
-            <w:pPr>
-              <w:spacing w:before="0" w:line="240" w:lineRule="auto"/>
-              <w:ind w:right="-360"/>
-              <w:rPr>
-                <w:rFonts w:ascii="Times New Roman" w:hAnsi="Times New Roman"/>
-                <w:b/>
-                <w:szCs w:val="22"/>
-              </w:rPr>
-            </w:pPr>
-            <w:r>
-              <w:rPr>
-                <w:rFonts w:ascii="Times New Roman" w:hAnsi="Times New Roman"/>
-                <w:b/>
-                <w:szCs w:val="22"/>
-              </w:rPr>
-              <w:t>1</w:t>
-            </w:r>
-            <w:r>
-              <w:rPr>
-                <w:rFonts w:ascii="Times New Roman" w:hAnsi="Times New Roman"/>
-                <w:b/>
-                <w:szCs w:val="22"/>
-              </w:rPr>
-              <w:t>0</w:t>
-            </w:r>
-            <w:r>
-              <w:rPr>
-                <w:rFonts w:ascii="Times New Roman" w:hAnsi="Times New Roman"/>
-                <w:b/>
-                <w:szCs w:val="22"/>
-              </w:rPr>
-              <w:t>.1.</w:t>
-            </w:r>
-          </w:p>
-        </w:tc>
-        <w:tc>
-          <w:tcPr>
-            <w:tcW w:w="2970" w:type="dxa"/>
-            <w:vAlign w:val="bottom"/>
-          </w:tcPr>
-          <w:p>
-            <w:pPr>
-              <w:tabs>
-                <w:tab w:val="left" w:pos="1800"/>
-              </w:tabs>
-              <w:spacing w:before="0" w:line="240" w:lineRule="auto"/>
-              <w:jc w:val="center"/>
-              <w:rPr>
-                <w:rFonts w:ascii="Times New Roman" w:hAnsi="Times New Roman"/>
-                <w:szCs w:val="22"/>
-              </w:rPr>
-            </w:pPr>
-          </w:p>
-        </w:tc>
-        <w:tc>
-          <w:tcPr>
-            <w:tcW w:w="6660" w:type="dxa"/>
-            <w:vAlign w:val="center"/>
-          </w:tcPr>
-          <w:p>
-            <w:pPr>
-              <w:spacing w:before="0" w:line="240" w:lineRule="auto"/>
-              <w:ind w:right="-360"/>
-              <w:rPr>
-                <w:rFonts w:ascii="Times New Roman" w:hAnsi="Times New Roman"/>
-                <w:szCs w:val="22"/>
-              </w:rPr>
-            </w:pPr>
-          </w:p>
-        </w:tc>
-      </w:tr>
-    </w:tbl>
-    <w:p>
-      <w:pPr>
-        <w:spacing w:before="0" w:line="240" w:lineRule="auto"/>
-      </w:pPr>
-    </w:p>
-    <w:tbl>
-      <w:tblPr>
-        <w:tblStyle w:val="TableGrid"/>
-        <w:tblW w:w="10530" w:type="dxa"/>
-        <w:tblInd w:w="-612" w:type="dxa"/>
-        <w:tblBorders>
-          <w:top w:val="single" w:sz="4" w:space="0" w:color="auto"/>
-          <w:left w:val="single" w:sz="4" w:space="0" w:color="auto"/>
-          <w:bottom w:val="single" w:sz="4" w:space="0" w:color="auto"/>
-          <w:right w:val="single" w:sz="4" w:space="0" w:color="auto"/>
-          <w:insideH w:val="single" w:sz="4" w:space="0" w:color="auto"/>
-          <w:insideV w:val="single" w:sz="4" w:space="0" w:color="auto"/>
-        </w:tblBorders>
-        <w:tblLook w:val="04A0" w:firstRow="1" w:lastRow="0" w:firstColumn="1" w:lastColumn="0" w:noHBand="0" w:noVBand="1"/>
-      </w:tblPr>
-      <w:tblGrid>
-        <w:gridCol w:w="900"/>
-        <w:gridCol w:w="1980"/>
-        <w:gridCol w:w="7650"/>
-      </w:tblGrid>
-      <w:tr>
-        <w:trPr>
-          <w:trHeight w:val="288"/>
-        </w:trPr>
-        <w:tc>
-          <w:tcPr>
-            <w:tcW w:w="900" w:type="dxa"/>
-          </w:tcPr>
-          <w:p>
-            <w:pPr>
-              <w:spacing w:before="0" w:line="240" w:lineRule="auto"/>
-              <w:ind w:right="-360"/>
-              <w:rPr>
-                <w:rFonts w:ascii="Times New Roman" w:hAnsi="Times New Roman"/>
-                <w:b/>
-                <w:bCs/>
-                <w:szCs w:val="22"/>
-              </w:rPr>
-            </w:pPr>
-            <w:r>
-              <w:rPr>
-                <w:rFonts w:ascii="Times New Roman" w:hAnsi="Times New Roman"/>
-                <w:b/>
-                <w:bCs/>
-                <w:szCs w:val="22"/>
-              </w:rPr>
-              <w:t>1</w:t>
-            </w:r>
-            <w:r>
-              <w:rPr>
-                <w:rFonts w:ascii="Times New Roman" w:hAnsi="Times New Roman"/>
-                <w:b/>
-                <w:bCs/>
-                <w:szCs w:val="22"/>
-              </w:rPr>
-              <w:t>1</w:t>
-            </w:r>
-            <w:r>
-              <w:rPr>
-                <w:rFonts w:ascii="Times New Roman" w:hAnsi="Times New Roman"/>
-                <w:b/>
-                <w:bCs/>
-                <w:szCs w:val="22"/>
-              </w:rPr>
-              <w:t>.0.</w:t>
-            </w:r>
-          </w:p>
-        </w:tc>
-        <w:tc>
-          <w:tcPr>
-            <w:tcW w:w="9630" w:type="dxa"/>
-            <w:gridSpan w:val="2"/>
-          </w:tcPr>
-          <w:p>
-            <w:pPr>
-              <w:spacing w:before="0" w:line="240" w:lineRule="auto"/>
-              <w:ind w:right="-360"/>
-              <w:rPr>
-                <w:rFonts w:ascii="Times New Roman" w:hAnsi="Times New Roman"/>
-                <w:szCs w:val="22"/>
-              </w:rPr>
-            </w:pPr>
-            <w:r>
-              <w:rPr>
-                <w:rFonts w:ascii="Times New Roman" w:hAnsi="Times New Roman"/>
-                <w:b/>
-                <w:szCs w:val="22"/>
-              </w:rPr>
-              <w:t>History:</w:t>
-            </w:r>
-          </w:p>
-        </w:tc>
-      </w:tr>
-      <w:tr>
-        <w:trPr>
-          <w:trHeight w:val="288"/>
-        </w:trPr>
-        <w:tc>
-          <w:tcPr>
-            <w:tcW w:w="900" w:type="dxa"/>
-          </w:tcPr>
-          <w:p>
-            <w:pPr>
-              <w:spacing w:before="0" w:line="240" w:lineRule="auto"/>
-              <w:ind w:left="-105" w:right="-108"/>
-              <w:jc w:val="center"/>
-              <w:rPr>
-                <w:rFonts w:ascii="Times New Roman" w:hAnsi="Times New Roman"/>
-                <w:szCs w:val="22"/>
-              </w:rPr>
-            </w:pPr>
-            <w:r>
-              <w:rPr>
-                <w:rFonts w:ascii="Times New Roman" w:hAnsi="Times New Roman"/>
-                <w:b/>
-                <w:bCs/>
-                <w:szCs w:val="22"/>
-              </w:rPr>
-              <w:t>Version Number</w:t>
-            </w:r>
-          </w:p>
-        </w:tc>
-        <w:tc>
-          <w:tcPr>
-            <w:tcW w:w="1980" w:type="dxa"/>
-            <w:vAlign w:val="center"/>
-          </w:tcPr>
-          <w:p>
-            <w:pPr>
-              <w:spacing w:before="0" w:line="240" w:lineRule="auto"/>
-              <w:ind w:left="-43" w:right="-166"/>
-              <w:jc w:val="center"/>
-              <w:rPr>
-                <w:rFonts w:ascii="Times New Roman" w:hAnsi="Times New Roman"/>
-                <w:b/>
-                <w:bCs/>
-                <w:szCs w:val="22"/>
-              </w:rPr>
-            </w:pPr>
-            <w:r>
-              <w:rPr>
-                <w:rFonts w:ascii="Times New Roman" w:hAnsi="Times New Roman"/>
-                <w:b/>
-                <w:bCs/>
-                <w:szCs w:val="22"/>
-              </w:rPr>
-              <w:t>Effective Date</w:t>
-            </w:r>
-          </w:p>
-        </w:tc>
-        <w:tc>
-          <w:tcPr>
-            <w:tcW w:w="7650" w:type="dxa"/>
-            <w:vAlign w:val="center"/>
-          </w:tcPr>
-          <w:p>
-            <w:pPr>
-              <w:spacing w:before="0" w:line="240" w:lineRule="auto"/>
-              <w:ind w:left="-43" w:right="-166"/>
-              <w:jc w:val="center"/>
-              <w:rPr>
-                <w:rFonts w:ascii="Times New Roman" w:hAnsi="Times New Roman"/>
-                <w:b/>
-                <w:bCs/>
-                <w:szCs w:val="22"/>
-              </w:rPr>
-            </w:pPr>
-            <w:r>
-              <w:rPr>
-                <w:rFonts w:ascii="Times New Roman" w:hAnsi="Times New Roman"/>
-                <w:b/>
-                <w:bCs/>
-                <w:szCs w:val="22"/>
-              </w:rPr>
-              <w:t>Description of Change</w:t>
-            </w:r>
-          </w:p>
-        </w:tc>
-      </w:tr>
-      <w:tr>
-        <w:trPr>
-          <w:trHeight w:val="288"/>
-        </w:trPr>
-        <w:tc>
-          <w:tcPr>
-            <w:tcW w:w="900" w:type="dxa"/>
-          </w:tcPr>
-          <w:p>
-            <w:pPr>
-              <w:spacing w:before="0" w:line="240" w:lineRule="auto"/>
-              <w:ind w:right="-360"/>
-              <w:rPr>
-                <w:rFonts w:ascii="Times New Roman" w:hAnsi="Times New Roman"/>
-                <w:b/>
-                <w:bCs/>
-                <w:szCs w:val="22"/>
-              </w:rPr>
-            </w:pPr>
-          </w:p>
-        </w:tc>
-        <w:tc>
-          <w:tcPr>
-            <w:tcW w:w="1980" w:type="dxa"/>
-            <w:vAlign w:val="center"/>
-          </w:tcPr>
-          <w:p>
-            <w:pPr>
-              <w:spacing w:before="0" w:line="240" w:lineRule="auto"/>
-              <w:ind w:left="-43" w:right="-166"/>
-              <w:jc w:val="center"/>
-              <w:rPr>
-                <w:rFonts w:ascii="Times New Roman" w:hAnsi="Times New Roman"/>
-                <w:b/>
-                <w:bCs/>
-                <w:szCs w:val="22"/>
-              </w:rPr>
-            </w:pPr>
-          </w:p>
-        </w:tc>
-        <w:tc>
-          <w:tcPr>
-            <w:tcW w:w="7650" w:type="dxa"/>
-            <w:vAlign w:val="center"/>
-          </w:tcPr>
-          <w:p>
-            <w:pPr>
-              <w:spacing w:before="0" w:line="240" w:lineRule="auto"/>
-              <w:ind w:left="-43" w:right="-166"/>
-              <w:jc w:val="center"/>
-              <w:rPr>
-                <w:rFonts w:ascii="Times New Roman" w:hAnsi="Times New Roman"/>
-                <w:b/>
-                <w:bCs/>
-                <w:szCs w:val="22"/>
-              </w:rPr>
-            </w:pPr>
-          </w:p>
-        </w:tc>
-      </w:tr>
-    </w:tbl>
-    <w:p>
-      <w:pPr>
-        <w:spacing w:before="0" w:line="240" w:lineRule="auto"/>
-      </w:pPr>
-    </w:p>
-    <w:tbl>
-      <w:tblPr>
-        <w:tblStyle w:val="TableGrid"/>
-        <w:tblW w:w="10544" w:type="dxa"/>
-        <w:tblInd w:w="-612" w:type="dxa"/>
-        <w:tblBorders>
-          <w:top w:val="single" w:sz="4" w:space="0" w:color="auto"/>
-          <w:left w:val="single" w:sz="4" w:space="0" w:color="auto"/>
-          <w:bottom w:val="single" w:sz="4" w:space="0" w:color="auto"/>
-          <w:right w:val="single" w:sz="4" w:space="0" w:color="auto"/>
-          <w:insideH w:val="single" w:sz="4" w:space="0" w:color="auto"/>
-          <w:insideV w:val="single" w:sz="4" w:space="0" w:color="auto"/>
-        </w:tblBorders>
-        <w:tblLook w:val="04A0" w:firstRow="1" w:lastRow="0" w:firstColumn="1" w:lastColumn="0" w:noHBand="0" w:noVBand="1"/>
-      </w:tblPr>
-      <w:tblGrid>
-        <w:gridCol w:w="900"/>
-        <w:gridCol w:w="9644"/>
-      </w:tblGrid>
-      <w:tr>
-        <w:trPr>
-          <w:trHeight w:val="288"/>
-        </w:trPr>
-        <w:tc>
-          <w:tcPr>
-            <w:tcW w:w="900" w:type="dxa"/>
-          </w:tcPr>
-          <w:p>
-            <w:pPr>
-              <w:spacing w:before="0" w:line="240" w:lineRule="auto"/>
-              <w:ind w:right="-360"/>
-              <w:rPr>
-                <w:rFonts w:ascii="Times New Roman" w:hAnsi="Times New Roman"/>
-                <w:b/>
-                <w:bCs/>
-                <w:szCs w:val="22"/>
-              </w:rPr>
-            </w:pPr>
-            <w:r>
-              <w:rPr>
-                <w:rFonts w:ascii="Times New Roman" w:hAnsi="Times New Roman"/>
-                <w:b/>
-                <w:bCs/>
-                <w:szCs w:val="22"/>
-              </w:rPr>
-              <w:t>1</w:t>
-            </w:r>
-            <w:r>
-              <w:rPr>
-                <w:rFonts w:ascii="Times New Roman" w:hAnsi="Times New Roman"/>
-                <w:b/>
-                <w:bCs/>
-                <w:szCs w:val="22"/>
-              </w:rPr>
-              <w:t>2</w:t>
-            </w:r>
-            <w:r>
-              <w:rPr>
-                <w:rFonts w:ascii="Times New Roman" w:hAnsi="Times New Roman"/>
-                <w:b/>
-                <w:bCs/>
-                <w:szCs w:val="22"/>
-              </w:rPr>
-              <w:t>.0.</w:t>
-            </w:r>
-          </w:p>
-        </w:tc>
-        <w:tc>
-          <w:tcPr>
-            <w:tcW w:w="9644" w:type="dxa"/>
-          </w:tcPr>
-          <w:p>
-            <w:pPr>
-              <w:spacing w:before="0" w:line="240" w:lineRule="auto"/>
-              <w:ind w:left="-30"/>
-              <w:jc w:val="both"/>
-              <w:rPr>
-                <w:rFonts w:ascii="Times New Roman" w:hAnsi="Times New Roman"/>
-                <w:szCs w:val="22"/>
-              </w:rPr>
-            </w:pPr>
-            <w:r>
-              <w:rPr>
-                <w:rFonts w:ascii="Times New Roman" w:hAnsi="Times New Roman"/>
-                <w:b/>
-                <w:bCs/>
-                <w:szCs w:val="22"/>
-              </w:rPr>
-              <w:t>Distribution</w:t>
-            </w:r>
-            <w:r>
-              <w:rPr>
-                <w:rFonts w:ascii="Times New Roman" w:hAnsi="Times New Roman"/>
-                <w:b/>
-                <w:szCs w:val="22"/>
-              </w:rPr>
-              <w:t xml:space="preserve"> List</w:t>
-            </w:r>
-            <w:r>
-              <w:rPr>
-                <w:rFonts w:ascii="Times New Roman" w:hAnsi="Times New Roman"/>
-                <w:b/>
-                <w:szCs w:val="22"/>
-              </w:rPr>
-              <w:t>:</w:t>
-            </w:r>
-          </w:p>
-        </w:tc>
-      </w:tr>
-      <w:tr>
-        <w:trPr>
-          <w:trHeight w:val="288"/>
-        </w:trPr>
-        <w:tc>
-          <w:tcPr>
-            <w:tcW w:w="900" w:type="dxa"/>
-          </w:tcPr>
-          <w:p>
-            <w:pPr>
-              <w:spacing w:before="0" w:line="240" w:lineRule="auto"/>
-              <w:ind w:right="-360"/>
-              <w:rPr>
-                <w:rFonts w:ascii="Times New Roman" w:hAnsi="Times New Roman"/>
-                <w:b/>
-                <w:szCs w:val="22"/>
-              </w:rPr>
-            </w:pPr>
-            <w:r>
-              <w:rPr>
-                <w:rFonts w:ascii="Times New Roman" w:hAnsi="Times New Roman"/>
-                <w:b/>
-                <w:szCs w:val="22"/>
-              </w:rPr>
-              <w:t>12.1.</w:t>
-            </w:r>
-          </w:p>
-        </w:tc>
-        <w:tc>
-          <w:tcPr>
-            <w:tcW w:w="9644" w:type="dxa"/>
-          </w:tcPr>
-          <w:p>
-            <w:pPr>
-              <w:spacing w:before="0" w:line="240" w:lineRule="auto"/>
-              <w:ind w:right="-360"/>
-              <w:rPr>
-                <w:rFonts w:ascii="Times New Roman" w:hAnsi="Times New Roman"/>
-                <w:b/>
-                <w:szCs w:val="22"/>
-              </w:rPr>
-            </w:pPr>
-            <w:r>
-              <w:rPr>
-                <w:rFonts w:ascii="Times New Roman" w:hAnsi="Times New Roman"/>
-                <w:b/>
-                <w:szCs w:val="22"/>
-              </w:rPr>
-              <w:t>Electronic Distribution</w:t>
-            </w:r>
-            <w:r>
-              <w:rPr>
-                <w:rFonts w:ascii="Times New Roman" w:hAnsi="Times New Roman"/>
-                <w:b/>
-                <w:szCs w:val="22"/>
-              </w:rPr>
-              <w:t>:</w:t>
-            </w:r>
-          </w:p>
-        </w:tc>
-      </w:tr>
-      <w:tr>
-        <w:trPr>
-          <w:trHeight w:val="288"/>
-        </w:trPr>
-        <w:tc>
-          <w:tcPr>
-            <w:tcW w:w="900" w:type="dxa"/>
-          </w:tcPr>
-          <w:p>
-            <w:pPr>
-              <w:spacing w:before="0" w:line="240" w:lineRule="auto"/>
-              <w:ind w:right="-360"/>
-              <w:rPr>
-                <w:rFonts w:ascii="Times New Roman" w:hAnsi="Times New Roman"/>
-                <w:szCs w:val="22"/>
-              </w:rPr>
-            </w:pPr>
-            <w:r>
-              <w:rPr>
-                <w:rFonts w:ascii="Times New Roman" w:hAnsi="Times New Roman"/>
-                <w:szCs w:val="22"/>
-              </w:rPr>
-              <w:t>12.1.1</w:t>
-            </w:r>
-          </w:p>
-        </w:tc>
-        <w:tc>
-          <w:tcPr>
-            <w:tcW w:w="9644" w:type="dxa"/>
-          </w:tcPr>
-          <w:p>
-            <w:pPr>
-              <w:spacing w:before="0" w:line="240" w:lineRule="auto"/>
-              <w:ind w:left="360" w:right="-360"/>
-              <w:rPr>
-                <w:rFonts w:ascii="Times New Roman" w:hAnsi="Times New Roman"/>
-                <w:color w:val="000000" w:themeColor="text1"/>
-                <w:szCs w:val="22"/>
-              </w:rPr>
-            </w:pPr>
-          </w:p>
-        </w:tc>
-      </w:tr>
-      <w:tr>
-        <w:trPr>
-          <w:trHeight w:val="288"/>
-        </w:trPr>
-        <w:tc>
-          <w:tcPr>
-            <w:tcW w:w="900" w:type="dxa"/>
-          </w:tcPr>
-          <w:p>
-            <w:pPr>
-              <w:spacing w:before="0" w:line="240" w:lineRule="auto"/>
-              <w:ind w:right="-360"/>
-              <w:rPr>
-                <w:rFonts w:ascii="Times New Roman" w:hAnsi="Times New Roman"/>
-                <w:b/>
-                <w:szCs w:val="22"/>
-              </w:rPr>
-            </w:pPr>
-            <w:r>
-              <w:rPr>
-                <w:rFonts w:ascii="Times New Roman" w:hAnsi="Times New Roman"/>
-                <w:b/>
-                <w:szCs w:val="22"/>
-              </w:rPr>
-              <w:t>12.2.</w:t>
-            </w:r>
-          </w:p>
-        </w:tc>
-        <w:tc>
-          <w:tcPr>
-            <w:tcW w:w="9644" w:type="dxa"/>
-          </w:tcPr>
-          <w:p>
-            <w:pPr>
-              <w:spacing w:before="0" w:line="240" w:lineRule="auto"/>
-              <w:ind w:right="-360"/>
-              <w:rPr>
-                <w:rFonts w:ascii="Times New Roman" w:hAnsi="Times New Roman"/>
-                <w:szCs w:val="22"/>
-              </w:rPr>
-            </w:pPr>
-            <w:r>
-              <w:rPr>
-                <w:rFonts w:ascii="Times New Roman" w:hAnsi="Times New Roman"/>
-                <w:b/>
-                <w:szCs w:val="22"/>
-              </w:rPr>
-              <w:t>Point of Use:</w:t>
-            </w:r>
-          </w:p>
-        </w:tc>
-      </w:tr>
-      <w:tr>
-        <w:trPr>
-          <w:trHeight w:val="288"/>
-        </w:trPr>
-        <w:tc>
-          <w:tcPr>
-            <w:tcW w:w="900" w:type="dxa"/>
-          </w:tcPr>
-          <w:p>
-            <w:pPr>
-              <w:spacing w:before="0" w:line="240" w:lineRule="auto"/>
-              <w:ind w:right="-360"/>
-              <w:rPr>
-                <w:rFonts w:ascii="Times New Roman" w:hAnsi="Times New Roman"/>
-                <w:szCs w:val="22"/>
-              </w:rPr>
-            </w:pPr>
-            <w:r>
-              <w:rPr>
-                <w:rFonts w:ascii="Times New Roman" w:hAnsi="Times New Roman"/>
-                <w:szCs w:val="22"/>
-              </w:rPr>
-              <w:t>12.2.1</w:t>
-            </w:r>
-          </w:p>
-        </w:tc>
-        <w:tc>
-          <w:tcPr>
-            <w:tcW w:w="9644" w:type="dxa"/>
-          </w:tcPr>
-          <w:p>
-            <w:pPr>
-              <w:spacing w:before="0" w:line="240" w:lineRule="auto"/>
-              <w:ind w:left="360" w:right="-360"/>
-              <w:rPr>
-                <w:rFonts w:ascii="Times New Roman" w:hAnsi="Times New Roman"/>
-                <w:color w:val="000000" w:themeColor="text1"/>
-                <w:szCs w:val="22"/>
-              </w:rPr>
-            </w:pPr>
-          </w:p>
-        </w:tc>
-      </w:tr>
-    </w:tbl>
-    <w:p>
-      <w:pPr>
-        <w:spacing w:before="0"/>
-        <w:ind w:right="-360"/>
+        <w:jc w:val="both"/>
         <w:rPr>
           <w:rFonts w:ascii="Times New Roman" w:hAnsi="Times New Roman"/>
-          <w:i/>
-          <w:szCs w:val="22"/>
         </w:rPr>
       </w:pPr>
-    </w:p>
-    <w:p>
-      <w:pPr>
-        <w:spacing w:before="0"/>
-        <w:ind w:right="-360"/>
+      <w:r>
         <w:rPr>
           <w:rFonts w:ascii="Times New Roman" w:hAnsi="Times New Roman"/>
-          <w:i/>
-          <w:szCs w:val="22"/>
         </w:rPr>
-      </w:pPr>
+        <w:t>{{DocumentContent}}</w:t>
+      </w:r>
     </w:p>
     <w:sectPr>
       <w:headerReference w:type="default" r:id="rId8"/>
@@ -2424,51 +63,23 @@
       <w:tblLook w:val="04A0" w:firstRow="1" w:lastRow="0" w:firstColumn="1" w:lastColumn="0" w:noHBand="0" w:noVBand="1"/>
     </w:tblPr>
     <w:tblGrid>
-      <w:gridCol w:w="1911"/>
-      <w:gridCol w:w="1705"/>
-      <w:gridCol w:w="1706"/>
-      <w:gridCol w:w="1706"/>
-      <w:gridCol w:w="1751"/>
-      <w:gridCol w:w="1751"/>
+      <w:gridCol w:w="2106"/>
+      <w:gridCol w:w="2106"/>
+      <w:gridCol w:w="2106"/>
+      <w:gridCol w:w="2106"/>
+      <w:gridCol w:w="2106"/>
     </w:tblGrid>
     <w:tr>
       <w:trPr>
-        <w:trHeight w:val="467"/>
+        <w:trHeight w:val="400"/>
       </w:trPr>
       <w:tc>
         <w:tcPr>
-          <w:tcW w:w="1911" w:type="dxa"/>
+          <w:tcW w:w="2106" w:type="dxa"/>
           <w:vAlign w:val="center"/>
         </w:tcPr>
         <w:p>
           <w:pPr>
-            <w:tabs>
-              <w:tab w:val="center" w:pos="4680"/>
-              <w:tab w:val="right" w:pos="9360"/>
-            </w:tabs>
-            <w:spacing w:before="0"/>
-            <w:jc w:val="center"/>
-            <w:rPr>
-              <w:rFonts w:ascii="Times New Roman" w:hAnsi="Times New Roman"/>
-            </w:rPr>
-          </w:pPr>
-          <w:bookmarkStart w:id="0" w:name="_Hlk181951689"/>
-        </w:p>
-      </w:tc>
-      <w:tc>
-        <w:tcPr>
-          <w:tcW w:w="1705" w:type="dxa"/>
-          <w:tcBorders>
-            <w:right w:val="single" w:sz="4" w:space="0" w:color="auto"/>
-          </w:tcBorders>
-          <w:vAlign w:val="center"/>
-        </w:tcPr>
-        <w:p>
-          <w:pPr>
-            <w:tabs>
-              <w:tab w:val="center" w:pos="4680"/>
-              <w:tab w:val="right" w:pos="9360"/>
-            </w:tabs>
             <w:spacing w:before="0"/>
             <w:jc w:val="center"/>
             <w:rPr>
@@ -2477,254 +88,25 @@
               <w:i/>
             </w:rPr>
           </w:pPr>
+          <w:bookmarkStart w:id="0" w:name="_Hlk181951689"/>
           <w:r>
             <w:rPr>
               <w:rFonts w:ascii="Times New Roman" w:hAnsi="Times New Roman"/>
               <w:b/>
               <w:i/>
             </w:rPr>
-            <w:t>Written By</w:t>
+            <w:t>Role</w:t>
           </w:r>
         </w:p>
       </w:tc>
       <w:tc>
         <w:tcPr>
-          <w:tcW w:w="3412" w:type="dxa"/>
-          <w:gridSpan w:val="2"/>
+          <w:tcW w:w="2106" w:type="dxa"/>
           <w:vAlign w:val="center"/>
         </w:tcPr>
         <w:p>
           <w:pPr>
-            <w:tabs>
-              <w:tab w:val="center" w:pos="4680"/>
-              <w:tab w:val="right" w:pos="9360"/>
-            </w:tabs>
             <w:spacing w:before="0"/>
-            <w:jc w:val="center"/>
-            <w:rPr>
-              <w:rFonts w:ascii="Times New Roman" w:hAnsi="Times New Roman"/>
-              <w:b/>
-              <w:i/>
-            </w:rPr>
-          </w:pPr>
-          <w:r>
-            <w:rPr>
-              <w:rFonts w:ascii="Times New Roman" w:hAnsi="Times New Roman"/>
-              <w:b/>
-              <w:i/>
-            </w:rPr>
-            <w:t>Reviewed By</w:t>
-          </w:r>
-        </w:p>
-      </w:tc>
-      <w:tc>
-        <w:tcPr>
-          <w:tcW w:w="1751" w:type="dxa"/>
-          <w:vAlign w:val="center"/>
-        </w:tcPr>
-        <w:p>
-          <w:pPr>
-            <w:tabs>
-              <w:tab w:val="center" w:pos="4680"/>
-              <w:tab w:val="right" w:pos="9360"/>
-            </w:tabs>
-            <w:spacing w:before="0"/>
-            <w:ind w:left="-141" w:right="-92"/>
-            <w:jc w:val="center"/>
-            <w:rPr>
-              <w:rFonts w:ascii="Times New Roman" w:hAnsi="Times New Roman"/>
-              <w:b/>
-              <w:i/>
-            </w:rPr>
-          </w:pPr>
-          <w:r>
-            <w:rPr>
-              <w:rFonts w:ascii="Times New Roman" w:hAnsi="Times New Roman"/>
-              <w:b/>
-              <w:i/>
-            </w:rPr>
-            <w:t>Approved By</w:t>
-          </w:r>
-        </w:p>
-      </w:tc>
-      <w:tc>
-        <w:tcPr>
-          <w:tcW w:w="1751" w:type="dxa"/>
-          <w:vAlign w:val="center"/>
-        </w:tcPr>
-        <w:p>
-          <w:pPr>
-            <w:tabs>
-              <w:tab w:val="center" w:pos="4680"/>
-              <w:tab w:val="right" w:pos="9360"/>
-            </w:tabs>
-            <w:spacing w:before="0"/>
-            <w:ind w:left="-141" w:right="-92"/>
-            <w:jc w:val="center"/>
-            <w:rPr>
-              <w:rFonts w:ascii="Times New Roman" w:hAnsi="Times New Roman"/>
-              <w:i/>
-            </w:rPr>
-          </w:pPr>
-          <w:r>
-            <w:rPr>
-              <w:rFonts w:ascii="Times New Roman" w:hAnsi="Times New Roman"/>
-              <w:b/>
-              <w:i/>
-            </w:rPr>
-            <w:t>Authorized By</w:t>
-          </w:r>
-        </w:p>
-      </w:tc>
-    </w:tr>
-    <w:tr>
-      <w:trPr>
-        <w:trHeight w:val="603"/>
-      </w:trPr>
-      <w:tc>
-        <w:tcPr>
-          <w:tcW w:w="1911" w:type="dxa"/>
-          <w:vAlign w:val="center"/>
-        </w:tcPr>
-        <w:p>
-          <w:pPr>
-            <w:tabs>
-              <w:tab w:val="center" w:pos="4680"/>
-              <w:tab w:val="right" w:pos="9360"/>
-            </w:tabs>
-            <w:spacing w:before="0" w:line="240" w:lineRule="auto"/>
-            <w:ind w:left="-18" w:right="-69"/>
-            <w:jc w:val="center"/>
-            <w:rPr>
-              <w:rFonts w:ascii="Times New Roman" w:hAnsi="Times New Roman"/>
-              <w:b/>
-              <w:i/>
-            </w:rPr>
-          </w:pPr>
-          <w:r>
-            <w:rPr>
-              <w:rFonts w:ascii="Times New Roman" w:hAnsi="Times New Roman"/>
-              <w:b/>
-              <w:i/>
-            </w:rPr>
-            <w:t>Signature &amp; Date</w:t>
-          </w:r>
-        </w:p>
-      </w:tc>
-      <w:tc>
-        <w:tcPr>
-          <w:tcW w:w="1705" w:type="dxa"/>
-          <w:tcBorders>
-            <w:right w:val="single" w:sz="4" w:space="0" w:color="auto"/>
-          </w:tcBorders>
-          <w:vAlign w:val="center"/>
-        </w:tcPr>
-        <w:p>
-          <w:pPr>
-            <w:tabs>
-              <w:tab w:val="center" w:pos="4680"/>
-              <w:tab w:val="right" w:pos="9360"/>
-            </w:tabs>
-            <w:spacing w:before="0" w:line="240" w:lineRule="auto"/>
-            <w:rPr>
-              <w:rFonts w:ascii="Times New Roman" w:hAnsi="Times New Roman"/>
-            </w:rPr>
-          </w:pPr>
-        </w:p>
-      </w:tc>
-      <w:tc>
-        <w:tcPr>
-          <w:tcW w:w="1706" w:type="dxa"/>
-        </w:tcPr>
-        <w:p>
-          <w:pPr>
-            <w:tabs>
-              <w:tab w:val="center" w:pos="4680"/>
-              <w:tab w:val="right" w:pos="9360"/>
-            </w:tabs>
-            <w:spacing w:before="0" w:line="240" w:lineRule="auto"/>
-            <w:jc w:val="center"/>
-            <w:rPr>
-              <w:rFonts w:ascii="Times New Roman" w:hAnsi="Times New Roman"/>
-            </w:rPr>
-          </w:pPr>
-        </w:p>
-      </w:tc>
-      <w:tc>
-        <w:tcPr>
-          <w:tcW w:w="1706" w:type="dxa"/>
-          <w:tcBorders>
-            <w:left w:val="single" w:sz="4" w:space="0" w:color="auto"/>
-          </w:tcBorders>
-          <w:vAlign w:val="center"/>
-        </w:tcPr>
-        <w:p>
-          <w:pPr>
-            <w:tabs>
-              <w:tab w:val="center" w:pos="4680"/>
-              <w:tab w:val="right" w:pos="9360"/>
-            </w:tabs>
-            <w:spacing w:before="0" w:line="240" w:lineRule="auto"/>
-            <w:ind w:left="-108" w:right="-108"/>
-            <w:jc w:val="center"/>
-            <w:rPr>
-              <w:rFonts w:ascii="Times New Roman" w:hAnsi="Times New Roman"/>
-            </w:rPr>
-          </w:pPr>
-        </w:p>
-      </w:tc>
-      <w:tc>
-        <w:tcPr>
-          <w:tcW w:w="1751" w:type="dxa"/>
-        </w:tcPr>
-        <w:p>
-          <w:pPr>
-            <w:tabs>
-              <w:tab w:val="center" w:pos="4680"/>
-              <w:tab w:val="right" w:pos="9360"/>
-            </w:tabs>
-            <w:spacing w:before="0" w:line="240" w:lineRule="auto"/>
-            <w:rPr>
-              <w:rFonts w:ascii="Times New Roman" w:hAnsi="Times New Roman"/>
-            </w:rPr>
-          </w:pPr>
-        </w:p>
-      </w:tc>
-      <w:tc>
-        <w:tcPr>
-          <w:tcW w:w="1751" w:type="dxa"/>
-          <w:vAlign w:val="center"/>
-        </w:tcPr>
-        <w:p>
-          <w:pPr>
-            <w:tabs>
-              <w:tab w:val="center" w:pos="4680"/>
-              <w:tab w:val="right" w:pos="9360"/>
-            </w:tabs>
-            <w:spacing w:before="0" w:line="240" w:lineRule="auto"/>
-            <w:rPr>
-              <w:rFonts w:ascii="Times New Roman" w:hAnsi="Times New Roman"/>
-            </w:rPr>
-          </w:pPr>
-        </w:p>
-      </w:tc>
-    </w:tr>
-    <w:tr>
-      <w:trPr>
-        <w:trHeight w:val="452"/>
-      </w:trPr>
-      <w:tc>
-        <w:tcPr>
-          <w:tcW w:w="1911" w:type="dxa"/>
-          <w:vAlign w:val="center"/>
-        </w:tcPr>
-        <w:p>
-          <w:pPr>
-            <w:tabs>
-              <w:tab w:val="center" w:pos="4680"/>
-              <w:tab w:val="right" w:pos="9360"/>
-            </w:tabs>
-            <w:spacing w:before="0" w:line="240" w:lineRule="auto"/>
             <w:jc w:val="center"/>
             <w:rPr>
               <w:rFonts w:ascii="Times New Roman" w:hAnsi="Times New Roman"/>
@@ -2744,127 +126,12 @@
       </w:tc>
       <w:tc>
         <w:tcPr>
-          <w:tcW w:w="1705" w:type="dxa"/>
-          <w:tcBorders>
-            <w:top w:val="single" w:sz="4" w:space="0" w:color="000000"/>
-            <w:left w:val="single" w:sz="4" w:space="0" w:color="000000"/>
-            <w:bottom w:val="single" w:sz="4" w:space="0" w:color="000000"/>
-            <w:right w:val="single" w:sz="4" w:space="0" w:color="auto"/>
-          </w:tcBorders>
+          <w:tcW w:w="2106" w:type="dxa"/>
           <w:vAlign w:val="center"/>
         </w:tcPr>
         <w:p>
           <w:pPr>
-            <w:tabs>
-              <w:tab w:val="center" w:pos="4680"/>
-              <w:tab w:val="right" w:pos="9360"/>
-            </w:tabs>
-            <w:spacing w:before="0" w:line="240" w:lineRule="auto"/>
-            <w:jc w:val="center"/>
-            <w:rPr>
-              <w:rFonts w:ascii="Times New Roman" w:hAnsi="Times New Roman"/>
-            </w:rPr>
-          </w:pPr>
-        </w:p>
-      </w:tc>
-      <w:tc>
-        <w:tcPr>
-          <w:tcW w:w="1706" w:type="dxa"/>
-          <w:vAlign w:val="center"/>
-        </w:tcPr>
-        <w:p>
-          <w:pPr>
-            <w:tabs>
-              <w:tab w:val="center" w:pos="4680"/>
-              <w:tab w:val="right" w:pos="9360"/>
-            </w:tabs>
-            <w:spacing w:before="0" w:line="240" w:lineRule="auto"/>
-            <w:ind w:left="-108" w:right="-108"/>
-            <w:jc w:val="center"/>
-            <w:rPr>
-              <w:rFonts w:ascii="Times New Roman" w:hAnsi="Times New Roman"/>
-            </w:rPr>
-          </w:pPr>
-        </w:p>
-      </w:tc>
-      <w:tc>
-        <w:tcPr>
-          <w:tcW w:w="1706" w:type="dxa"/>
-          <w:tcBorders>
-            <w:left w:val="single" w:sz="4" w:space="0" w:color="auto"/>
-          </w:tcBorders>
-          <w:vAlign w:val="center"/>
-        </w:tcPr>
-        <w:p>
-          <w:pPr>
-            <w:tabs>
-              <w:tab w:val="center" w:pos="4680"/>
-              <w:tab w:val="right" w:pos="9360"/>
-            </w:tabs>
-            <w:spacing w:before="0" w:line="240" w:lineRule="auto"/>
-            <w:ind w:left="-108" w:right="-108"/>
-            <w:jc w:val="center"/>
-            <w:rPr>
-              <w:rFonts w:ascii="Times New Roman" w:hAnsi="Times New Roman"/>
-            </w:rPr>
-          </w:pPr>
-        </w:p>
-      </w:tc>
-      <w:tc>
-        <w:tcPr>
-          <w:tcW w:w="1751" w:type="dxa"/>
-          <w:vAlign w:val="center"/>
-        </w:tcPr>
-        <w:p>
-          <w:pPr>
-            <w:tabs>
-              <w:tab w:val="center" w:pos="4680"/>
-              <w:tab w:val="right" w:pos="9360"/>
-            </w:tabs>
-            <w:spacing w:before="0" w:line="240" w:lineRule="auto"/>
-            <w:jc w:val="center"/>
-            <w:rPr>
-              <w:rFonts w:ascii="Times New Roman" w:hAnsi="Times New Roman"/>
-            </w:rPr>
-          </w:pPr>
-        </w:p>
-      </w:tc>
-      <w:tc>
-        <w:tcPr>
-          <w:tcW w:w="1751" w:type="dxa"/>
-          <w:vAlign w:val="center"/>
-        </w:tcPr>
-        <w:p>
-          <w:pPr>
-            <w:tabs>
-              <w:tab w:val="center" w:pos="4680"/>
-              <w:tab w:val="right" w:pos="9360"/>
-            </w:tabs>
-            <w:spacing w:before="0" w:line="240" w:lineRule="auto"/>
-            <w:jc w:val="center"/>
-            <w:rPr>
-              <w:rFonts w:ascii="Times New Roman" w:hAnsi="Times New Roman"/>
-            </w:rPr>
-          </w:pPr>
-        </w:p>
-      </w:tc>
-    </w:tr>
-    <w:tr>
-      <w:trPr>
-        <w:trHeight w:val="452"/>
-      </w:trPr>
-      <w:tc>
-        <w:tcPr>
-          <w:tcW w:w="1911" w:type="dxa"/>
-          <w:vAlign w:val="center"/>
-        </w:tcPr>
-        <w:p>
-          <w:pPr>
-            <w:tabs>
-              <w:tab w:val="center" w:pos="4680"/>
-              <w:tab w:val="right" w:pos="9360"/>
-            </w:tabs>
-            <w:spacing w:before="0" w:line="240" w:lineRule="auto"/>
+            <w:spacing w:before="0"/>
             <w:jc w:val="center"/>
             <w:rPr>
               <w:rFonts w:ascii="Times New Roman" w:hAnsi="Times New Roman"/>
@@ -2884,109 +151,161 @@
       </w:tc>
       <w:tc>
         <w:tcPr>
-          <w:tcW w:w="1705" w:type="dxa"/>
-          <w:tcBorders>
-            <w:top w:val="single" w:sz="4" w:space="0" w:color="000000"/>
-            <w:left w:val="single" w:sz="4" w:space="0" w:color="000000"/>
-            <w:bottom w:val="single" w:sz="4" w:space="0" w:color="000000"/>
-            <w:right w:val="single" w:sz="4" w:space="0" w:color="auto"/>
-          </w:tcBorders>
+          <w:tcW w:w="2106" w:type="dxa"/>
           <w:vAlign w:val="center"/>
         </w:tcPr>
         <w:p>
           <w:pPr>
-            <w:tabs>
-              <w:tab w:val="center" w:pos="4680"/>
-              <w:tab w:val="right" w:pos="9360"/>
-            </w:tabs>
-            <w:spacing w:before="0" w:line="240" w:lineRule="auto"/>
-            <w:ind w:left="-108" w:right="-108"/>
+            <w:spacing w:before="0"/>
             <w:jc w:val="center"/>
             <w:rPr>
               <w:rFonts w:ascii="Times New Roman" w:hAnsi="Times New Roman"/>
+              <w:b/>
+              <w:i/>
             </w:rPr>
           </w:pPr>
+          <w:r>
+            <w:rPr>
+              <w:rFonts w:ascii="Times New Roman" w:hAnsi="Times New Roman"/>
+              <w:b/>
+              <w:i/>
+            </w:rPr>
+            <w:t>Signature</w:t>
+          </w:r>
         </w:p>
       </w:tc>
       <w:tc>
         <w:tcPr>
-          <w:tcW w:w="1706" w:type="dxa"/>
-        </w:tcPr>
-        <w:p>
-          <w:pPr>
-            <w:tabs>
-              <w:tab w:val="center" w:pos="4680"/>
-              <w:tab w:val="right" w:pos="9360"/>
-            </w:tabs>
-            <w:spacing w:before="0" w:line="240" w:lineRule="auto"/>
-            <w:ind w:left="-108" w:right="-108"/>
-            <w:jc w:val="center"/>
-            <w:rPr>
-              <w:rFonts w:ascii="Times New Roman" w:hAnsi="Times New Roman"/>
-            </w:rPr>
-          </w:pPr>
-        </w:p>
-      </w:tc>
-      <w:tc>
-        <w:tcPr>
-          <w:tcW w:w="1706" w:type="dxa"/>
-          <w:tcBorders>
-            <w:left w:val="single" w:sz="4" w:space="0" w:color="auto"/>
-          </w:tcBorders>
+          <w:tcW w:w="2106" w:type="dxa"/>
           <w:vAlign w:val="center"/>
         </w:tcPr>
         <w:p>
           <w:pPr>
-            <w:tabs>
-              <w:tab w:val="center" w:pos="4680"/>
-              <w:tab w:val="right" w:pos="9360"/>
-            </w:tabs>
-            <w:spacing w:before="0" w:line="240" w:lineRule="auto"/>
-            <w:ind w:left="-108" w:right="-108"/>
+            <w:spacing w:before="0"/>
             <w:jc w:val="center"/>
             <w:rPr>
               <w:rFonts w:ascii="Times New Roman" w:hAnsi="Times New Roman"/>
+              <w:i/>
             </w:rPr>
           </w:pPr>
+          <w:r>
+            <w:rPr>
+              <w:rFonts w:ascii="Times New Roman" w:hAnsi="Times New Roman"/>
+              <w:b/>
+              <w:i/>
+            </w:rPr>
+            <w:t>Date</w:t>
+          </w:r>
         </w:p>
       </w:tc>
+    </w:tr>
+    <w:tr>
+      <w:trPr>
+        <w:trHeight w:val="500"/>
+      </w:trPr>
       <w:tc>
         <w:tcPr>
-          <w:tcW w:w="1751" w:type="dxa"/>
+          <w:tcW w:w="2106" w:type="dxa"/>
           <w:vAlign w:val="center"/>
         </w:tcPr>
         <w:p>
           <w:pPr>
-            <w:tabs>
-              <w:tab w:val="center" w:pos="4680"/>
-              <w:tab w:val="right" w:pos="9360"/>
-            </w:tabs>
             <w:spacing w:before="0" w:line="240" w:lineRule="auto"/>
             <w:jc w:val="center"/>
             <w:rPr>
               <w:rFonts w:ascii="Times New Roman" w:hAnsi="Times New Roman"/>
             </w:rPr>
           </w:pPr>
+          <w:r>
+            <w:rPr>
+              <w:rFonts w:ascii="Times New Roman" w:hAnsi="Times New Roman"/>
+            </w:rPr>
+            <w:t>{{ApproverRole}}</w:t>
+          </w:r>
         </w:p>
       </w:tc>
       <w:tc>
         <w:tcPr>
-          <w:tcW w:w="1751" w:type="dxa"/>
+          <w:tcW w:w="2106" w:type="dxa"/>
           <w:vAlign w:val="center"/>
         </w:tcPr>
         <w:p>
           <w:pPr>
-            <w:tabs>
-              <w:tab w:val="center" w:pos="4680"/>
-              <w:tab w:val="right" w:pos="9360"/>
-            </w:tabs>
             <w:spacing w:before="0" w:line="240" w:lineRule="auto"/>
-            <w:ind w:left="-114" w:right="-113"/>
             <w:jc w:val="center"/>
             <w:rPr>
               <w:rFonts w:ascii="Times New Roman" w:hAnsi="Times New Roman"/>
             </w:rPr>
           </w:pPr>
+          <w:r>
+            <w:rPr>
+              <w:rFonts w:ascii="Times New Roman" w:hAnsi="Times New Roman"/>
+            </w:rPr>
+            <w:t>{{ApproverName}}</w:t>
+          </w:r>
+        </w:p>
+      </w:tc>
+      <w:tc>
+        <w:tcPr>
+          <w:tcW w:w="2106" w:type="dxa"/>
+          <w:vAlign w:val="center"/>
+        </w:tcPr>
+        <w:p>
+          <w:pPr>
+            <w:spacing w:before="0" w:line="240" w:lineRule="auto"/>
+            <w:jc w:val="center"/>
+            <w:rPr>
+              <w:rFonts w:ascii="Times New Roman" w:hAnsi="Times New Roman"/>
+            </w:rPr>
+          </w:pPr>
+          <w:r>
+            <w:rPr>
+              <w:rFonts w:ascii="Times New Roman" w:hAnsi="Times New Roman"/>
+            </w:rPr>
+            <w:t>{{ApproverDesignation}}</w:t>
+          </w:r>
+        </w:p>
+      </w:tc>
+      <w:tc>
+        <w:tcPr>
+          <w:tcW w:w="2106" w:type="dxa"/>
+          <w:vAlign w:val="center"/>
+        </w:tcPr>
+        <w:p>
+          <w:pPr>
+            <w:spacing w:before="0" w:line="240" w:lineRule="auto"/>
+            <w:jc w:val="center"/>
+            <w:rPr>
+              <w:rFonts w:ascii="Times New Roman" w:hAnsi="Times New Roman"/>
+            </w:rPr>
+          </w:pPr>
+          <w:r>
+            <w:rPr>
+              <w:rFonts w:ascii="Times New Roman" w:hAnsi="Times New Roman"/>
+            </w:rPr>
+            <w:t>{{ApproverSignature}}</w:t>
+          </w:r>
+        </w:p>
+      </w:tc>
+      <w:tc>
+        <w:tcPr>
+          <w:tcW w:w="2106" w:type="dxa"/>
+          <w:vAlign w:val="center"/>
+        </w:tcPr>
+        <w:p>
+          <w:pPr>
+            <w:spacing w:before="0" w:line="240" w:lineRule="auto"/>
+            <w:jc w:val="center"/>
+            <w:rPr>
+              <w:rFonts w:ascii="Times New Roman" w:hAnsi="Times New Roman"/>
+            </w:rPr>
+          </w:pPr>
+          <w:r>
+            <w:rPr>
+              <w:rFonts w:ascii="Times New Roman" w:hAnsi="Times New Roman"/>
+            </w:rPr>
+            <w:t>{{ApprovalDate}}</w:t>
+          </w:r>
         </w:p>
       </w:tc>
     </w:tr>
@@ -3246,6 +565,14 @@
             </w:rPr>
             <w:t xml:space="preserve">Title: </w:t>
           </w:r>
+          <w:r>
+            <w:rPr>
+              <w:rFonts w:ascii="Times New Roman" w:hAnsi="Times New Roman"/>
+              <w:b w:val="0"/>
+              <w:i/>
+            </w:rPr>
+            <w:t>{{DocumentTitle}}</w:t>
+          </w:r>
         </w:p>
       </w:tc>
       <w:tc>
@@ -3268,6 +595,13 @@
               <w:szCs w:val="22"/>
             </w:rPr>
             <w:t xml:space="preserve">Doc No.: </w:t>
+          </w:r>
+          <w:r>
+            <w:rPr>
+              <w:rFonts w:ascii="Times New Roman" w:hAnsi="Times New Roman" w:cs="Times New Roman"/>
+              <w:szCs w:val="22"/>
+            </w:rPr>
+            <w:t>{{DocumentNumber}}</w:t>
           </w:r>
         </w:p>
       </w:tc>
@@ -3297,6 +631,14 @@
             </w:rPr>
             <w:t xml:space="preserve">Version No: </w:t>
           </w:r>
+          <w:r>
+            <w:rPr>
+              <w:rFonts w:ascii="Times New Roman" w:hAnsi="Times New Roman"/>
+              <w:i/>
+              <w:szCs w:val="22"/>
+            </w:rPr>
+            <w:t>{{Version}}</w:t>
+          </w:r>
         </w:p>
       </w:tc>
       <w:tc>
@@ -3325,6 +667,14 @@
             </w:rPr>
             <w:t xml:space="preserve">Supersede: </w:t>
           </w:r>
+          <w:r>
+            <w:rPr>
+              <w:rFonts w:ascii="Times New Roman" w:hAnsi="Times New Roman"/>
+              <w:i/>
+              <w:szCs w:val="22"/>
+            </w:rPr>
+            <w:t>{{Supersede}}</w:t>
+          </w:r>
         </w:p>
         <w:p>
           <w:pPr>
@@ -3347,6 +697,14 @@
             </w:rPr>
             <w:t xml:space="preserve">Version No.: </w:t>
           </w:r>
+          <w:r>
+            <w:rPr>
+              <w:rFonts w:ascii="Times New Roman" w:hAnsi="Times New Roman"/>
+              <w:i/>
+              <w:szCs w:val="22"/>
+            </w:rPr>
+            <w:t>{{Version}}</w:t>
+          </w:r>
         </w:p>
         <w:p>
           <w:pPr>
@@ -3368,6 +726,14 @@
               <w:szCs w:val="22"/>
             </w:rPr>
             <w:t>Effective Date:</w:t>
+          </w:r>
+          <w:r>
+            <w:rPr>
+              <w:rFonts w:ascii="Times New Roman" w:hAnsi="Times New Roman"/>
+              <w:i/>
+              <w:szCs w:val="22"/>
+            </w:rPr>
+            <w:t xml:space="preserve"> {{EffectiveDate}}</w:t>
           </w:r>
         </w:p>
       </w:tc>
@@ -3417,6 +783,13 @@
             </w:rPr>
             <w:t>Effective Date:</w:t>
           </w:r>
+          <w:r>
+            <w:rPr>
+              <w:rFonts w:ascii="Times New Roman" w:hAnsi="Times New Roman"/>
+              <w:i/>
+            </w:rPr>
+            <w:t xml:space="preserve"> {{EffectiveDate}}</w:t>
+          </w:r>
         </w:p>
       </w:tc>
       <w:tc>
@@ -3456,7 +829,7 @@
               <w:rFonts w:ascii="Times New Roman" w:hAnsi="Times New Roman"/>
               <w:i/>
             </w:rPr>
-            <w:t xml:space="preserve"> On change</w:t>
+            <w:t xml:space="preserve"> {{ReviewDate}}</w:t>
           </w:r>
         </w:p>
       </w:tc>

</xml_diff>